<commit_message>
feat(confirmationLetters): adopt the firm's newer 5-column letter format
Matches conformation letter new.xlsx: the table gains a Tax Free column
(Particulars | Tax Free | Taxable | Vat | Total), row Total is now Tax
Free + Taxable + Vat, and zero amounts print as "-" accounting-style. The
header gains an editable Letter Date (B.S., defaults to today). Sales row
is labelled "Sales" and the receiver side "Receiver Signature".

The review grid now exposes Tax Free alongside Taxable/Vat for both sides
(pre-filled from the workbook's column D, which was previously discarded).

Co-Authored-By: Claude Sonnet 5 <noreply@anthropic.com>
</commit_message>
<xml_diff>
--- a/assets/templates/confirmation-letter.docx
+++ b/assets/templates/confirmation-letter.docx
@@ -26,7 +26,7 @@
     </w:p>
     <w:p>
       <w:r>
-        <w:t xml:space="preserve">Vat No :- {{partyPan}}</w:t>
+        <w:t xml:space="preserve">Vat No :-  {{partyPan}}</w:t>
       </w:r>
     </w:p>
     <w:p>
@@ -106,24 +106,20 @@
         <w:tblLook w:val="04A0" w:firstRow="1" w:lastRow="0" w:firstColumn="1" w:lastColumn="0" w:noHBand="0" w:noVBand="1"/>
       </w:tblPr>
       <w:tblGrid>
-        <w:gridCol w:w="2409"/>
-        <w:gridCol w:w="2409"/>
-        <w:gridCol w:w="2409"/>
-        <w:gridCol w:w="2409"/>
+        <w:gridCol w:w="2836"/>
+        <w:gridCol w:w="1700"/>
+        <w:gridCol w:w="1700"/>
+        <w:gridCol w:w="1700"/>
+        <w:gridCol w:w="1700"/>
       </w:tblGrid>
       <w:tr>
-        <w:trPr>
-          <w:trHeight w:val="288"/>
-        </w:trPr>
-        <w:tc>
-          <w:tcPr>
-            <w:tcW w:w="2409" w:type="dxa"/>
-          </w:tcPr>
-          <w:p>
-            <w:pPr>
-              <w:tabs>
-                <w:tab w:val="left" w:pos="1845"/>
-              </w:tabs>
+        <w:tc>
+          <w:tcPr>
+            <w:tcW w:w="2836" w:type="dxa"/>
+            <w:vAlign w:val="center"/>
+          </w:tcPr>
+          <w:p>
+            <w:pPr>
               <w:rPr>
                 <w:b/>
               </w:rPr>
@@ -132,52 +128,58 @@
               <w:rPr>
                 <w:b/>
               </w:rPr>
-              <w:t>P</w:t>
-            </w:r>
-            <w:r>
+              <w:t xml:space="preserve">Particulars</w:t>
+            </w:r>
+          </w:p>
+        </w:tc>
+        <w:tc>
+          <w:tcPr>
+            <w:tcW w:w="1700" w:type="dxa"/>
+            <w:vAlign w:val="center"/>
+          </w:tcPr>
+          <w:p>
+            <w:pPr>
+              <w:jc w:val="center"/>
               <w:rPr>
                 <w:b/>
               </w:rPr>
-              <w:t xml:space="preserve">articulars </w:t>
-            </w:r>
-          </w:p>
-        </w:tc>
-        <w:tc>
-          <w:tcPr>
-            <w:tcW w:w="2409" w:type="dxa"/>
-          </w:tcPr>
-          <w:p>
-            <w:pPr>
-              <w:tabs>
-                <w:tab w:val="left" w:pos="1845"/>
-              </w:tabs>
+            </w:pPr>
+            <w:r>
               <w:rPr>
                 <w:b/>
               </w:rPr>
-            </w:pPr>
-            <w:r>
+              <w:t xml:space="preserve">Tax Free Value (Rs)</w:t>
+            </w:r>
+          </w:p>
+        </w:tc>
+        <w:tc>
+          <w:tcPr>
+            <w:tcW w:w="1700" w:type="dxa"/>
+            <w:vAlign w:val="center"/>
+          </w:tcPr>
+          <w:p>
+            <w:pPr>
+              <w:jc w:val="center"/>
               <w:rPr>
                 <w:b/>
               </w:rPr>
-              <w:t>V</w:t>
-            </w:r>
+            </w:pPr>
             <w:r>
               <w:rPr>
                 <w:b/>
               </w:rPr>
-              <w:t>alue (RS)</w:t>
-            </w:r>
-          </w:p>
-        </w:tc>
-        <w:tc>
-          <w:tcPr>
-            <w:tcW w:w="2409" w:type="dxa"/>
-          </w:tcPr>
-          <w:p>
-            <w:pPr>
-              <w:tabs>
-                <w:tab w:val="left" w:pos="1845"/>
-              </w:tabs>
+              <w:t xml:space="preserve">Taxable Value (RS)</w:t>
+            </w:r>
+          </w:p>
+        </w:tc>
+        <w:tc>
+          <w:tcPr>
+            <w:tcW w:w="1700" w:type="dxa"/>
+            <w:vAlign w:val="center"/>
+          </w:tcPr>
+          <w:p>
+            <w:pPr>
+              <w:jc w:val="center"/>
               <w:rPr>
                 <w:b/>
               </w:rPr>
@@ -186,332 +188,307 @@
               <w:rPr>
                 <w:b/>
               </w:rPr>
-              <w:t>V</w:t>
-            </w:r>
-            <w:r>
+              <w:t xml:space="preserve">Vat (RS)</w:t>
+            </w:r>
+          </w:p>
+        </w:tc>
+        <w:tc>
+          <w:tcPr>
+            <w:tcW w:w="1700" w:type="dxa"/>
+            <w:vAlign w:val="center"/>
+          </w:tcPr>
+          <w:p>
+            <w:pPr>
+              <w:jc w:val="center"/>
               <w:rPr>
                 <w:b/>
               </w:rPr>
-              <w:t>at(RS)</w:t>
-            </w:r>
-          </w:p>
-        </w:tc>
-        <w:tc>
-          <w:tcPr>
-            <w:tcW w:w="2409" w:type="dxa"/>
-          </w:tcPr>
-          <w:p>
-            <w:pPr>
-              <w:tabs>
-                <w:tab w:val="left" w:pos="1845"/>
-              </w:tabs>
+            </w:pPr>
+            <w:r>
               <w:rPr>
                 <w:b/>
               </w:rPr>
-            </w:pPr>
-            <w:r>
-              <w:rPr>
-                <w:b/>
-              </w:rPr>
-              <w:t>T</w:t>
-            </w:r>
-            <w:r>
-              <w:rPr>
-                <w:b/>
-              </w:rPr>
-              <w:t>otal</w:t>
-            </w:r>
-            <w:r>
-              <w:rPr>
-                <w:b/>
-              </w:rPr>
-              <w:t xml:space="preserve"> </w:t>
-            </w:r>
-            <w:r>
-              <w:rPr>
-                <w:b/>
-              </w:rPr>
-              <w:t>(RS)</w:t>
+              <w:t xml:space="preserve">Total (RS)</w:t>
             </w:r>
           </w:p>
         </w:tc>
       </w:tr>
       <w:tr>
-        <w:trPr>
-          <w:trHeight w:val="512"/>
-        </w:trPr>
-        <w:tc>
-          <w:tcPr>
-            <w:tcW w:w="2409" w:type="dxa"/>
-          </w:tcPr>
-          <w:p>
-            <w:pPr>
-              <w:tabs>
-                <w:tab w:val="left" w:pos="1845"/>
-              </w:tabs>
-            </w:pPr>
-            <w:r>
-              <w:t>Opening Balance</w:t>
-            </w:r>
-          </w:p>
-        </w:tc>
-        <w:tc>
-          <w:tcPr>
-            <w:tcW w:w="2409" w:type="dxa"/>
-          </w:tcPr>
-          <w:p>
-            <w:pPr>
-              <w:tabs>
-                <w:tab w:val="left" w:pos="1845"/>
-              </w:tabs>
-              <w:rPr>
-                <w:b/>
-              </w:rPr>
-            </w:pPr>
-            <w:r>
-              <w:t>{{openingBalance}}</w:t>
-            </w:r>
-          </w:p>
-        </w:tc>
-        <w:tc>
-          <w:tcPr>
-            <w:tcW w:w="2409" w:type="dxa"/>
-          </w:tcPr>
-          <w:p>
-            <w:pPr>
-              <w:tabs>
-                <w:tab w:val="left" w:pos="1845"/>
-              </w:tabs>
-              <w:rPr>
-                <w:b/>
-              </w:rPr>
-            </w:pPr>
-          </w:p>
-        </w:tc>
-        <w:tc>
-          <w:tcPr>
-            <w:tcW w:w="2409" w:type="dxa"/>
-          </w:tcPr>
-          <w:p>
-            <w:pPr>
-              <w:tabs>
-                <w:tab w:val="left" w:pos="1845"/>
-              </w:tabs>
-              <w:rPr>
-                <w:b/>
-              </w:rPr>
-            </w:pPr>
+        <w:tc>
+          <w:tcPr>
+            <w:tcW w:w="2836" w:type="dxa"/>
+            <w:vAlign w:val="center"/>
+          </w:tcPr>
+          <w:p>
+            <w:pPr/>
+            <w:r>
+              <w:t xml:space="preserve">Opening Balance</w:t>
+            </w:r>
+          </w:p>
+        </w:tc>
+        <w:tc>
+          <w:tcPr>
+            <w:tcW w:w="1700" w:type="dxa"/>
+            <w:vAlign w:val="center"/>
+          </w:tcPr>
+          <w:p>
+            <w:pPr>
+              <w:jc w:val="right"/>
+            </w:pPr>
+            <w:r>
+              <w:t xml:space="preserve">{{openingTaxfree}}</w:t>
+            </w:r>
+          </w:p>
+        </w:tc>
+        <w:tc>
+          <w:tcPr>
+            <w:tcW w:w="1700" w:type="dxa"/>
+            <w:vAlign w:val="center"/>
+          </w:tcPr>
+          <w:p>
+            <w:pPr>
+              <w:jc w:val="right"/>
+            </w:pPr>
+            <w:r>
+              <w:t xml:space="preserve">{{openingTaxable}}</w:t>
+            </w:r>
+          </w:p>
+        </w:tc>
+        <w:tc>
+          <w:tcPr>
+            <w:tcW w:w="1700" w:type="dxa"/>
+            <w:vAlign w:val="center"/>
+          </w:tcPr>
+          <w:p>
+            <w:pPr>
+              <w:jc w:val="right"/>
+            </w:pPr>
+            <w:r>
+              <w:t xml:space="preserve">{{openingVat}}</w:t>
+            </w:r>
+          </w:p>
+        </w:tc>
+        <w:tc>
+          <w:tcPr>
+            <w:tcW w:w="1700" w:type="dxa"/>
+            <w:vAlign w:val="center"/>
+          </w:tcPr>
+          <w:p>
+            <w:pPr>
+              <w:jc w:val="right"/>
+            </w:pPr>
+            <w:r>
+              <w:t xml:space="preserve">{{openingBalance}}</w:t>
+            </w:r>
           </w:p>
         </w:tc>
       </w:tr>
       <w:tr>
-        <w:trPr>
-          <w:trHeight w:val="465"/>
-        </w:trPr>
-        <w:tc>
-          <w:tcPr>
-            <w:tcW w:w="2409" w:type="dxa"/>
-          </w:tcPr>
-          <w:p>
-            <w:pPr>
-              <w:tabs>
-                <w:tab w:val="left" w:pos="1845"/>
-              </w:tabs>
-            </w:pPr>
-            <w:r>
-              <w:t>Taxable Sales</w:t>
-            </w:r>
-          </w:p>
-        </w:tc>
-        <w:tc>
-          <w:tcPr>
-            <w:tcW w:w="2409" w:type="dxa"/>
-          </w:tcPr>
-          <w:p>
-            <w:pPr>
-              <w:tabs>
-                <w:tab w:val="left" w:pos="1845"/>
-              </w:tabs>
+        <w:tc>
+          <w:tcPr>
+            <w:tcW w:w="2836" w:type="dxa"/>
+            <w:vAlign w:val="center"/>
+          </w:tcPr>
+          <w:p>
+            <w:pPr/>
+            <w:r>
+              <w:t xml:space="preserve">Sales</w:t>
+            </w:r>
+          </w:p>
+        </w:tc>
+        <w:tc>
+          <w:tcPr>
+            <w:tcW w:w="1700" w:type="dxa"/>
+            <w:vAlign w:val="center"/>
+          </w:tcPr>
+          <w:p>
+            <w:pPr>
               <w:jc w:val="right"/>
             </w:pPr>
             <w:r>
-              <w:t>{{salesTaxable}}</w:t>
-            </w:r>
-          </w:p>
-        </w:tc>
-        <w:tc>
-          <w:tcPr>
-            <w:tcW w:w="2409" w:type="dxa"/>
-          </w:tcPr>
-          <w:p>
-            <w:pPr>
-              <w:tabs>
-                <w:tab w:val="left" w:pos="1845"/>
-              </w:tabs>
-              <w:jc w:val="center"/>
-            </w:pPr>
-            <w:r>
-              <w:t>{{salesVat}}</w:t>
-            </w:r>
-          </w:p>
-        </w:tc>
-        <w:tc>
-          <w:tcPr>
-            <w:tcW w:w="2409" w:type="dxa"/>
+              <w:t xml:space="preserve">{{salesTaxfree}}</w:t>
+            </w:r>
+          </w:p>
+        </w:tc>
+        <w:tc>
+          <w:tcPr>
+            <w:tcW w:w="1700" w:type="dxa"/>
+            <w:vAlign w:val="center"/>
           </w:tcPr>
           <w:p>
             <w:pPr>
               <w:jc w:val="right"/>
-              <w:rPr>
-                <w:rFonts w:ascii="Arial" w:hAnsi="Arial" w:cs="Arial"/>
-                <w:sz w:val="20"/>
-                <w:szCs w:val="20"/>
-              </w:rPr>
-            </w:pPr>
-            <w:r>
-              <w:rPr>
-                <w:rFonts w:ascii="Arial" w:hAnsi="Arial" w:cs="Arial"/>
-                <w:sz w:val="20"/>
-                <w:szCs w:val="20"/>
-              </w:rPr>
-              <w:t>{{salesTotal}}</w:t>
+            </w:pPr>
+            <w:r>
+              <w:t xml:space="preserve">{{salesTaxable}}</w:t>
+            </w:r>
+          </w:p>
+        </w:tc>
+        <w:tc>
+          <w:tcPr>
+            <w:tcW w:w="1700" w:type="dxa"/>
+            <w:vAlign w:val="center"/>
+          </w:tcPr>
+          <w:p>
+            <w:pPr>
+              <w:jc w:val="right"/>
+            </w:pPr>
+            <w:r>
+              <w:t xml:space="preserve">{{salesVat}}</w:t>
+            </w:r>
+          </w:p>
+        </w:tc>
+        <w:tc>
+          <w:tcPr>
+            <w:tcW w:w="1700" w:type="dxa"/>
+            <w:vAlign w:val="center"/>
+          </w:tcPr>
+          <w:p>
+            <w:pPr>
+              <w:jc w:val="right"/>
+            </w:pPr>
+            <w:r>
+              <w:t xml:space="preserve">{{salesTotal}}</w:t>
             </w:r>
           </w:p>
         </w:tc>
       </w:tr>
       <w:tr>
-        <w:trPr>
-          <w:trHeight w:val="465"/>
-        </w:trPr>
-        <w:tc>
-          <w:tcPr>
-            <w:tcW w:w="2409" w:type="dxa"/>
-          </w:tcPr>
-          <w:p>
-            <w:pPr>
-              <w:tabs>
-                <w:tab w:val="left" w:pos="1845"/>
-              </w:tabs>
-            </w:pPr>
-            <w:r>
-              <w:t xml:space="preserve">Purchase </w:t>
-            </w:r>
-          </w:p>
-        </w:tc>
-        <w:tc>
-          <w:tcPr>
-            <w:tcW w:w="2409" w:type="dxa"/>
-          </w:tcPr>
-          <w:p>
-            <w:pPr>
-              <w:tabs>
-                <w:tab w:val="left" w:pos="1845"/>
-              </w:tabs>
-            </w:pPr>
-            <w:r>
-              <w:t>{{purchaseTaxable}}</w:t>
-            </w:r>
-          </w:p>
-        </w:tc>
-        <w:tc>
-          <w:tcPr>
-            <w:tcW w:w="2409" w:type="dxa"/>
-          </w:tcPr>
-          <w:p>
-            <w:pPr>
-              <w:tabs>
-                <w:tab w:val="left" w:pos="1845"/>
-              </w:tabs>
-            </w:pPr>
-            <w:r>
-              <w:t>{{purchaseVat}}</w:t>
-            </w:r>
-          </w:p>
-        </w:tc>
-        <w:tc>
-          <w:tcPr>
-            <w:tcW w:w="2409" w:type="dxa"/>
-          </w:tcPr>
-          <w:p>
-            <w:pPr>
-              <w:rPr>
-                <w:rFonts w:ascii="Arial" w:hAnsi="Arial" w:cs="Arial"/>
-                <w:sz w:val="20"/>
-                <w:szCs w:val="20"/>
-              </w:rPr>
-            </w:pPr>
-            <w:r>
-              <w:rPr>
-                <w:rFonts w:ascii="Arial" w:hAnsi="Arial" w:cs="Arial"/>
-                <w:sz w:val="20"/>
-                <w:szCs w:val="20"/>
-              </w:rPr>
-              <w:t>{{purchaseTotal}}</w:t>
+        <w:tc>
+          <w:tcPr>
+            <w:tcW w:w="2836" w:type="dxa"/>
+            <w:vAlign w:val="center"/>
+          </w:tcPr>
+          <w:p>
+            <w:pPr/>
+            <w:r>
+              <w:t xml:space="preserve">Purchase</w:t>
+            </w:r>
+          </w:p>
+        </w:tc>
+        <w:tc>
+          <w:tcPr>
+            <w:tcW w:w="1700" w:type="dxa"/>
+            <w:vAlign w:val="center"/>
+          </w:tcPr>
+          <w:p>
+            <w:pPr>
+              <w:jc w:val="right"/>
+            </w:pPr>
+            <w:r>
+              <w:t xml:space="preserve">{{purchaseTaxfree}}</w:t>
+            </w:r>
+          </w:p>
+        </w:tc>
+        <w:tc>
+          <w:tcPr>
+            <w:tcW w:w="1700" w:type="dxa"/>
+            <w:vAlign w:val="center"/>
+          </w:tcPr>
+          <w:p>
+            <w:pPr>
+              <w:jc w:val="right"/>
+            </w:pPr>
+            <w:r>
+              <w:t xml:space="preserve">{{purchaseTaxable}}</w:t>
+            </w:r>
+          </w:p>
+        </w:tc>
+        <w:tc>
+          <w:tcPr>
+            <w:tcW w:w="1700" w:type="dxa"/>
+            <w:vAlign w:val="center"/>
+          </w:tcPr>
+          <w:p>
+            <w:pPr>
+              <w:jc w:val="right"/>
+            </w:pPr>
+            <w:r>
+              <w:t xml:space="preserve">{{purchaseVat}}</w:t>
+            </w:r>
+          </w:p>
+        </w:tc>
+        <w:tc>
+          <w:tcPr>
+            <w:tcW w:w="1700" w:type="dxa"/>
+            <w:vAlign w:val="center"/>
+          </w:tcPr>
+          <w:p>
+            <w:pPr>
+              <w:jc w:val="right"/>
+            </w:pPr>
+            <w:r>
+              <w:t xml:space="preserve">{{purchaseTotal}}</w:t>
             </w:r>
           </w:p>
         </w:tc>
       </w:tr>
       <w:tr>
-        <w:trPr>
-          <w:trHeight w:val="458"/>
-        </w:trPr>
-        <w:tc>
-          <w:tcPr>
-            <w:tcW w:w="2409" w:type="dxa"/>
-          </w:tcPr>
-          <w:p>
-            <w:pPr>
-              <w:tabs>
-                <w:tab w:val="left" w:pos="1845"/>
-              </w:tabs>
-            </w:pPr>
-            <w:r>
-              <w:t>Closing Balance (</w:t>
-            </w:r>
-            <w:r>
-              <w:t>D</w:t>
-            </w:r>
-            <w:r>
-              <w:t>r.)</w:t>
-            </w:r>
-          </w:p>
-        </w:tc>
-        <w:tc>
-          <w:tcPr>
-            <w:tcW w:w="2409" w:type="dxa"/>
-          </w:tcPr>
-          <w:p>
-            <w:pPr>
-              <w:tabs>
-                <w:tab w:val="left" w:pos="1845"/>
-              </w:tabs>
-            </w:pPr>
-          </w:p>
-        </w:tc>
-        <w:tc>
-          <w:tcPr>
-            <w:tcW w:w="2409" w:type="dxa"/>
-          </w:tcPr>
-          <w:p>
-            <w:pPr>
-              <w:tabs>
-                <w:tab w:val="left" w:pos="1845"/>
-              </w:tabs>
-            </w:pPr>
-          </w:p>
-        </w:tc>
-        <w:tc>
-          <w:tcPr>
-            <w:tcW w:w="2409" w:type="dxa"/>
-          </w:tcPr>
-          <w:p>
-            <w:pPr>
-              <w:tabs>
-                <w:tab w:val="left" w:pos="1845"/>
-              </w:tabs>
-            </w:pPr>
-            <w:r>
-              <w:t>{{closingBalance}}</w:t>
+        <w:tc>
+          <w:tcPr>
+            <w:tcW w:w="2836" w:type="dxa"/>
+            <w:vAlign w:val="center"/>
+          </w:tcPr>
+          <w:p>
+            <w:pPr/>
+            <w:r>
+              <w:t xml:space="preserve">Closing Balance (Dr)</w:t>
+            </w:r>
+          </w:p>
+        </w:tc>
+        <w:tc>
+          <w:tcPr>
+            <w:tcW w:w="1700" w:type="dxa"/>
+            <w:vAlign w:val="center"/>
+          </w:tcPr>
+          <w:p>
+            <w:pPr>
+              <w:jc w:val="right"/>
+            </w:pPr>
+            <w:r>
+              <w:t xml:space="preserve">{{closingTaxfree}}</w:t>
+            </w:r>
+          </w:p>
+        </w:tc>
+        <w:tc>
+          <w:tcPr>
+            <w:tcW w:w="1700" w:type="dxa"/>
+            <w:vAlign w:val="center"/>
+          </w:tcPr>
+          <w:p>
+            <w:pPr>
+              <w:jc w:val="right"/>
+            </w:pPr>
+            <w:r>
+              <w:t xml:space="preserve">{{closingTaxable}}</w:t>
+            </w:r>
+          </w:p>
+        </w:tc>
+        <w:tc>
+          <w:tcPr>
+            <w:tcW w:w="1700" w:type="dxa"/>
+            <w:vAlign w:val="center"/>
+          </w:tcPr>
+          <w:p>
+            <w:pPr>
+              <w:jc w:val="right"/>
+            </w:pPr>
+            <w:r>
+              <w:t xml:space="preserve">{{closingVat}}</w:t>
+            </w:r>
+          </w:p>
+        </w:tc>
+        <w:tc>
+          <w:tcPr>
+            <w:tcW w:w="1700" w:type="dxa"/>
+            <w:vAlign w:val="center"/>
+          </w:tcPr>
+          <w:p>
+            <w:pPr>
+              <w:jc w:val="right"/>
+            </w:pPr>
+            <w:r>
+              <w:t xml:space="preserve">{{closingBalance}}</w:t>
             </w:r>
           </w:p>
         </w:tc>
@@ -625,7 +602,7 @@
       </w:r>
       <w:proofErr w:type="spellStart"/>
       <w:r>
-        <w:t>Signature</w:t>
+        <w:t>Receiver Signature</w:t>
       </w:r>
       <w:proofErr w:type="spellEnd"/>
       <w:r>
@@ -815,21 +792,7 @@
       <w:rPr>
         <w:sz w:val="30"/>
       </w:rPr>
-      <w:t xml:space="preserve">Pan </w:t>
-    </w:r>
-    <w:proofErr w:type="gramStart"/>
-    <w:r>
-      <w:rPr>
-        <w:sz w:val="30"/>
-      </w:rPr>
-      <w:t>No :</w:t>
-    </w:r>
-    <w:proofErr w:type="gramEnd"/>
-    <w:r>
-      <w:rPr>
-        <w:sz w:val="30"/>
-      </w:rPr>
-      <w:t xml:space="preserve"> {{firmPan}}</w:t>
+      <w:t xml:space="preserve">Pan No:- {{firmPan}}</w:t>
     </w:r>
   </w:p>
   <w:p>
@@ -867,7 +830,7 @@
       <w:rPr>
         <w:sz w:val="30"/>
       </w:rPr>
-      <w:t>Phone no: {{firmPhone}}</w:t>
+      <w:t xml:space="preserve">Phone No:- {{firmPhone}}          Date:- {{letterDate}}</w:t>
     </w:r>
   </w:p>
   <w:p>

</xml_diff>

<commit_message>
fix(confirmationLetters): rebuild letterhead to match the firm's target layout
The header is reconstructed cleanly: firm name + address centred, then
"Pan No:- <pan>  [tab]  Phone No:- <phone>" on one line and "Date:- <date>"
on the next, followed by a real paragraph bottom-border rule. Replaces the
old floating VML AutoShape line (which didn't render) and the leading-space
indentation that made the date value wrap onto its own line. Table row
labels are now bold with taller rows, and the contact line reads
"Phone no:-", matching the reference.

Co-Authored-By: Claude Opus 4.8 <noreply@anthropic.com>
</commit_message>
<xml_diff>
--- a/assets/templates/confirmation-letter.docx
+++ b/assets/templates/confirmation-letter.docx
@@ -113,6 +113,9 @@
         <w:gridCol w:w="1700"/>
       </w:tblGrid>
       <w:tr>
+        <w:trPr>
+          <w:trHeight w:val="340"/>
+        </w:trPr>
         <w:tc>
           <w:tcPr>
             <w:tcW w:w="2836" w:type="dxa"/>
@@ -139,7 +142,6 @@
           </w:tcPr>
           <w:p>
             <w:pPr>
-              <w:jc w:val="center"/>
               <w:rPr>
                 <w:b/>
               </w:rPr>
@@ -159,7 +161,6 @@
           </w:tcPr>
           <w:p>
             <w:pPr>
-              <w:jc w:val="center"/>
               <w:rPr>
                 <w:b/>
               </w:rPr>
@@ -179,7 +180,6 @@
           </w:tcPr>
           <w:p>
             <w:pPr>
-              <w:jc w:val="center"/>
               <w:rPr>
                 <w:b/>
               </w:rPr>
@@ -199,7 +199,6 @@
           </w:tcPr>
           <w:p>
             <w:pPr>
-              <w:jc w:val="center"/>
               <w:rPr>
                 <w:b/>
               </w:rPr>
@@ -214,14 +213,24 @@
         </w:tc>
       </w:tr>
       <w:tr>
+        <w:trPr>
+          <w:trHeight w:val="460"/>
+        </w:trPr>
         <w:tc>
           <w:tcPr>
             <w:tcW w:w="2836" w:type="dxa"/>
             <w:vAlign w:val="center"/>
           </w:tcPr>
           <w:p>
-            <w:pPr/>
-            <w:r>
+            <w:pPr>
+              <w:rPr>
+                <w:b/>
+              </w:rPr>
+            </w:pPr>
+            <w:r>
+              <w:rPr>
+                <w:b/>
+              </w:rPr>
               <w:t xml:space="preserve">Opening Balance</w:t>
             </w:r>
           </w:p>
@@ -284,14 +293,24 @@
         </w:tc>
       </w:tr>
       <w:tr>
+        <w:trPr>
+          <w:trHeight w:val="460"/>
+        </w:trPr>
         <w:tc>
           <w:tcPr>
             <w:tcW w:w="2836" w:type="dxa"/>
             <w:vAlign w:val="center"/>
           </w:tcPr>
           <w:p>
-            <w:pPr/>
-            <w:r>
+            <w:pPr>
+              <w:rPr>
+                <w:b/>
+              </w:rPr>
+            </w:pPr>
+            <w:r>
+              <w:rPr>
+                <w:b/>
+              </w:rPr>
               <w:t xml:space="preserve">Sales</w:t>
             </w:r>
           </w:p>
@@ -354,14 +373,24 @@
         </w:tc>
       </w:tr>
       <w:tr>
+        <w:trPr>
+          <w:trHeight w:val="460"/>
+        </w:trPr>
         <w:tc>
           <w:tcPr>
             <w:tcW w:w="2836" w:type="dxa"/>
             <w:vAlign w:val="center"/>
           </w:tcPr>
           <w:p>
-            <w:pPr/>
-            <w:r>
+            <w:pPr>
+              <w:rPr>
+                <w:b/>
+              </w:rPr>
+            </w:pPr>
+            <w:r>
+              <w:rPr>
+                <w:b/>
+              </w:rPr>
               <w:t xml:space="preserve">Purchase</w:t>
             </w:r>
           </w:p>
@@ -424,14 +453,24 @@
         </w:tc>
       </w:tr>
       <w:tr>
+        <w:trPr>
+          <w:trHeight w:val="460"/>
+        </w:trPr>
         <w:tc>
           <w:tcPr>
             <w:tcW w:w="2836" w:type="dxa"/>
             <w:vAlign w:val="center"/>
           </w:tcPr>
           <w:p>
-            <w:pPr/>
-            <w:r>
+            <w:pPr>
+              <w:rPr>
+                <w:b/>
+              </w:rPr>
+            </w:pPr>
+            <w:r>
+              <w:rPr>
+                <w:b/>
+              </w:rPr>
               <w:t xml:space="preserve">Closing Balance (Dr)</w:t>
             </w:r>
           </w:p>
@@ -525,7 +564,7 @@
         <w:t xml:space="preserve"> Phone </w:t>
       </w:r>
       <w:r>
-        <w:t xml:space="preserve"> no</w:t>
+        <w:t xml:space="preserve"> no:-</w:t>
       </w:r>
       <w:r>
         <w:rPr>
@@ -750,249 +789,65 @@
 <w:hdr xmlns:wpc="http://schemas.microsoft.com/office/word/2010/wordprocessingCanvas" xmlns:mc="http://schemas.openxmlformats.org/markup-compatibility/2006" xmlns:o="urn:schemas-microsoft-com:office:office" xmlns:r="http://schemas.openxmlformats.org/officeDocument/2006/relationships" xmlns:m="http://schemas.openxmlformats.org/officeDocument/2006/math" xmlns:v="urn:schemas-microsoft-com:vml" xmlns:wp14="http://schemas.microsoft.com/office/word/2010/wordprocessingDrawing" xmlns:wp="http://schemas.openxmlformats.org/drawingml/2006/wordprocessingDrawing" xmlns:w10="urn:schemas-microsoft-com:office:word" xmlns:w="http://schemas.openxmlformats.org/wordprocessingml/2006/main" xmlns:w14="http://schemas.microsoft.com/office/word/2010/wordml" xmlns:wpg="http://schemas.microsoft.com/office/word/2010/wordprocessingGroup" xmlns:wpi="http://schemas.microsoft.com/office/word/2010/wordprocessingInk" xmlns:wne="http://schemas.microsoft.com/office/word/2006/wordml" xmlns:wps="http://schemas.microsoft.com/office/word/2010/wordprocessingShape" mc:Ignorable="w14 wp14">
   <w:p>
     <w:pPr>
-      <w:pStyle w:val="Header"/>
       <w:jc w:val="center"/>
-      <w:rPr>
-        <w:b/>
-        <w:sz w:val="42"/>
-      </w:rPr>
     </w:pPr>
-    <w:proofErr w:type="spellStart"/>
     <w:r>
       <w:rPr>
         <w:b/>
-        <w:sz w:val="42"/>
+        <w:sz w:val="40"/>
       </w:rPr>
-      <w:t>{{firmName}}</w:t>
+      <w:t xml:space="preserve">{{firmName}}</w:t>
     </w:r>
   </w:p>
   <w:p>
     <w:pPr>
-      <w:pStyle w:val="Header"/>
       <w:jc w:val="center"/>
-      <w:rPr>
-        <w:sz w:val="34"/>
-      </w:rPr>
-    </w:pPr>
-    <w:r>
-      <w:rPr>
-        <w:sz w:val="34"/>
-      </w:rPr>
-      <w:t>{{firmAddress}}</w:t>
-    </w:r>
-  </w:p>
-  <w:p>
-    <w:pPr>
-      <w:pStyle w:val="Header"/>
-      <w:rPr>
-        <w:sz w:val="30"/>
-      </w:rPr>
     </w:pPr>
     <w:r>
       <w:rPr>
         <w:sz w:val="30"/>
       </w:rPr>
-      <w:t xml:space="preserve">Pan No:- {{firmPan}}</w:t>
+      <w:t xml:space="preserve">{{firmAddress}}</w:t>
     </w:r>
   </w:p>
   <w:p>
     <w:pPr>
-      <w:pStyle w:val="Header"/>
-      <w:rPr>
-        <w:sz w:val="30"/>
-      </w:rPr>
+      <w:tabs>
+        <w:tab w:val="left" w:pos="5400"/>
+      </w:tabs>
     </w:pPr>
     <w:r>
       <w:rPr>
-        <w:sz w:val="30"/>
+        <w:b/>
+        <w:sz w:val="22"/>
       </w:rPr>
-      <w:t xml:space="preserve">                                               </w:t>
+      <w:t xml:space="preserve">Pan No:-  {{firmPan}}</w:t>
     </w:r>
     <w:r>
       <w:rPr>
-        <w:sz w:val="30"/>
+        <w:b/>
+        <w:sz w:val="22"/>
       </w:rPr>
-      <w:t xml:space="preserve">      </w:t>
-    </w:r>
-    <w:r>
-      <w:rPr>
-        <w:sz w:val="30"/>
-      </w:rPr>
-      <w:t xml:space="preserve">                  </w:t>
-    </w:r>
-    <w:r>
-      <w:rPr>
-        <w:sz w:val="30"/>
-      </w:rPr>
-      <w:t xml:space="preserve">      </w:t>
-    </w:r>
-    <w:r>
-      <w:rPr>
-        <w:sz w:val="30"/>
-      </w:rPr>
-      <w:t xml:space="preserve">Phone No:- {{firmPhone}}          Date:- {{letterDate}}</w:t>
+      <w:tab/>
+      <w:t xml:space="preserve">Phone No:-  {{firmPhone}}</w:t>
     </w:r>
   </w:p>
   <w:p>
     <w:pPr>
-      <w:pStyle w:val="Header"/>
-      <w:rPr>
-        <w:sz w:val="30"/>
-      </w:rPr>
+      <w:tabs>
+        <w:tab w:val="left" w:pos="5400"/>
+      </w:tabs>
+      <w:pBdr>
+        <w:bottom w:val="single" w:sz="24" w:space="6" w:color="000000"/>
+      </w:pBdr>
     </w:pPr>
     <w:r>
       <w:rPr>
-        <w:noProof/>
-        <w:sz w:val="30"/>
-        <w:lang w:val="en-GB" w:eastAsia="en-GB" w:bidi="ne-NP"/>
+        <w:b/>
+        <w:sz w:val="22"/>
       </w:rPr>
-      <mc:AlternateContent>
-        <mc:Choice Requires="wps">
-          <w:drawing>
-            <wp:anchor distT="0" distB="0" distL="114300" distR="114300" simplePos="0" relativeHeight="251658240" behindDoc="0" locked="0" layoutInCell="1" allowOverlap="1" wp14:anchorId="01A15A4B" wp14:editId="2611A7AB">
-              <wp:simplePos x="0" y="0"/>
-              <wp:positionH relativeFrom="column">
-                <wp:posOffset>-9525</wp:posOffset>
-              </wp:positionH>
-              <wp:positionV relativeFrom="paragraph">
-                <wp:posOffset>50165</wp:posOffset>
-              </wp:positionV>
-              <wp:extent cx="6353175" cy="0"/>
-              <wp:effectExtent l="9525" t="12065" r="9525" b="16510"/>
-              <wp:wrapNone/>
-              <wp:docPr id="2" name="AutoShape 1"/>
-              <wp:cNvGraphicFramePr>
-                <a:graphicFrameLocks xmlns:a="http://schemas.openxmlformats.org/drawingml/2006/main"/>
-              </wp:cNvGraphicFramePr>
-              <a:graphic xmlns:a="http://schemas.openxmlformats.org/drawingml/2006/main">
-                <a:graphicData uri="http://schemas.microsoft.com/office/word/2010/wordprocessingShape">
-                  <wps:wsp>
-                    <wps:cNvCnPr>
-                      <a:cxnSpLocks noChangeShapeType="1"/>
-                    </wps:cNvCnPr>
-                    <wps:spPr bwMode="auto">
-                      <a:xfrm>
-                        <a:off x="0" y="0"/>
-                        <a:ext cx="6353175" cy="0"/>
-                      </a:xfrm>
-                      <a:prstGeom prst="straightConnector1">
-                        <a:avLst/>
-                      </a:prstGeom>
-                      <a:noFill/>
-                      <a:ln w="19050">
-                        <a:solidFill>
-                          <a:srgbClr val="000000"/>
-                        </a:solidFill>
-                        <a:round/>
-                        <a:headEnd/>
-                        <a:tailEnd/>
-                      </a:ln>
-                      <a:extLst>
-                        <a:ext uri="{909E8E84-426E-40DD-AFC4-6F175D3DCCD1}">
-                          <a14:hiddenFill xmlns:a14="http://schemas.microsoft.com/office/drawing/2010/main">
-                            <a:noFill/>
-                          </a14:hiddenFill>
-                        </a:ext>
-                      </a:extLst>
-                    </wps:spPr>
-                    <wps:bodyPr/>
-                  </wps:wsp>
-                </a:graphicData>
-              </a:graphic>
-              <wp14:sizeRelH relativeFrom="page">
-                <wp14:pctWidth>0</wp14:pctWidth>
-              </wp14:sizeRelH>
-              <wp14:sizeRelV relativeFrom="page">
-                <wp14:pctHeight>0</wp14:pctHeight>
-              </wp14:sizeRelV>
-            </wp:anchor>
-          </w:drawing>
-        </mc:Choice>
-        <mc:Fallback>
-          <w:pict>
-            <v:shapetype id="_x0000_t32" coordsize="21600,21600" o:spt="32" o:oned="t" path="m,l21600,21600e" filled="f">
-              <v:path arrowok="t" fillok="f" o:connecttype="none"/>
-              <o:lock v:ext="edit" shapetype="t"/>
-            </v:shapetype>
-            <v:shape id="AutoShape 1" o:spid="_x0000_s1026" type="#_x0000_t32" style="position:absolute;margin-left:-.75pt;margin-top:3.95pt;width:500.25pt;height:0;z-index:251658240;visibility:visible;mso-wrap-style:square;mso-width-percent:0;mso-height-percent:0;mso-wrap-distance-left:9pt;mso-wrap-distance-top:0;mso-wrap-distance-right:9pt;mso-wrap-distance-bottom:0;mso-position-horizontal:absolute;mso-position-horizontal-relative:text;mso-position-vertical:absolute;mso-position-vertical-relative:text;mso-width-percent:0;mso-height-percent:0;mso-width-relative:page;mso-height-relative:page" o:gfxdata="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" strokeweight="1.5pt"/>
-          </w:pict>
-        </mc:Fallback>
-      </mc:AlternateContent>
-    </w:r>
-    <w:r>
-      <w:rPr>
-        <w:noProof/>
-        <w:sz w:val="30"/>
-        <w:lang w:val="en-GB" w:eastAsia="en-GB" w:bidi="ne-NP"/>
-      </w:rPr>
-      <mc:AlternateContent>
-        <mc:Choice Requires="wps">
-          <w:drawing>
-            <wp:anchor distT="0" distB="0" distL="114300" distR="114300" simplePos="0" relativeHeight="251659264" behindDoc="0" locked="0" layoutInCell="1" allowOverlap="1" wp14:anchorId="0E5A1C59" wp14:editId="31FE3D6A">
-              <wp:simplePos x="0" y="0"/>
-              <wp:positionH relativeFrom="column">
-                <wp:posOffset>-9525</wp:posOffset>
-              </wp:positionH>
-              <wp:positionV relativeFrom="paragraph">
-                <wp:posOffset>78740</wp:posOffset>
-              </wp:positionV>
-              <wp:extent cx="6353175" cy="0"/>
-              <wp:effectExtent l="9525" t="12065" r="9525" b="16510"/>
-              <wp:wrapNone/>
-              <wp:docPr id="1" name="AutoShape 2"/>
-              <wp:cNvGraphicFramePr>
-                <a:graphicFrameLocks xmlns:a="http://schemas.openxmlformats.org/drawingml/2006/main"/>
-              </wp:cNvGraphicFramePr>
-              <a:graphic xmlns:a="http://schemas.openxmlformats.org/drawingml/2006/main">
-                <a:graphicData uri="http://schemas.microsoft.com/office/word/2010/wordprocessingShape">
-                  <wps:wsp>
-                    <wps:cNvCnPr>
-                      <a:cxnSpLocks noChangeShapeType="1"/>
-                    </wps:cNvCnPr>
-                    <wps:spPr bwMode="auto">
-                      <a:xfrm>
-                        <a:off x="0" y="0"/>
-                        <a:ext cx="6353175" cy="0"/>
-                      </a:xfrm>
-                      <a:prstGeom prst="straightConnector1">
-                        <a:avLst/>
-                      </a:prstGeom>
-                      <a:noFill/>
-                      <a:ln w="19050">
-                        <a:solidFill>
-                          <a:srgbClr val="000000"/>
-                        </a:solidFill>
-                        <a:round/>
-                        <a:headEnd/>
-                        <a:tailEnd/>
-                      </a:ln>
-                      <a:extLst>
-                        <a:ext uri="{909E8E84-426E-40DD-AFC4-6F175D3DCCD1}">
-                          <a14:hiddenFill xmlns:a14="http://schemas.microsoft.com/office/drawing/2010/main">
-                            <a:noFill/>
-                          </a14:hiddenFill>
-                        </a:ext>
-                      </a:extLst>
-                    </wps:spPr>
-                    <wps:bodyPr/>
-                  </wps:wsp>
-                </a:graphicData>
-              </a:graphic>
-              <wp14:sizeRelH relativeFrom="page">
-                <wp14:pctWidth>0</wp14:pctWidth>
-              </wp14:sizeRelH>
-              <wp14:sizeRelV relativeFrom="page">
-                <wp14:pctHeight>0</wp14:pctHeight>
-              </wp14:sizeRelV>
-            </wp:anchor>
-          </w:drawing>
-        </mc:Choice>
-        <mc:Fallback>
-          <w:pict>
-            <v:shape id="AutoShape 2" o:spid="_x0000_s1026" type="#_x0000_t32" style="position:absolute;margin-left:-.75pt;margin-top:6.2pt;width:500.25pt;height:0;z-index:251659264;visibility:visible;mso-wrap-style:square;mso-width-percent:0;mso-height-percent:0;mso-wrap-distance-left:9pt;mso-wrap-distance-top:0;mso-wrap-distance-right:9pt;mso-wrap-distance-bottom:0;mso-position-horizontal:absolute;mso-position-horizontal-relative:text;mso-position-vertical:absolute;mso-position-vertical-relative:text;mso-width-percent:0;mso-height-percent:0;mso-width-relative:page;mso-height-relative:page" o:gfxdata="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" strokeweight="1.5pt"/>
-          </w:pict>
-        </mc:Fallback>
-      </mc:AlternateContent>
+      <w:tab/>
+      <w:t xml:space="preserve">Date:-  {{letterDate}}</w:t>
     </w:r>
   </w:p>
 </w:hdr>

</xml_diff>

<commit_message>
fix(confirmationLetters): finalize letter formatting in Word, per user's own edit
User opened the template directly in Word and hand-tuned spacing/alignment
to match their reference (header Pan/Phone/Date + rule, signature block
layout). Verified all {{tokens}} and the {{#letters}}/{{^last}} loop
structure survived Word's re-save intact and render correctly end-to-end
against the app's docxtemplater pipeline before committing.

Co-Authored-By: Claude Sonnet 5 <noreply@anthropic.com>
</commit_message>
<xml_diff>
--- a/assets/templates/confirmation-letter.docx
+++ b/assets/templates/confirmation-letter.docx
@@ -1,6 +1,6 @@
 
 <file path=word/document.xml><?xml version="1.0" encoding="utf-8"?>
-<w:document xmlns:wpc="http://schemas.microsoft.com/office/word/2010/wordprocessingCanvas" xmlns:mc="http://schemas.openxmlformats.org/markup-compatibility/2006" xmlns:o="urn:schemas-microsoft-com:office:office" xmlns:r="http://schemas.openxmlformats.org/officeDocument/2006/relationships" xmlns:m="http://schemas.openxmlformats.org/officeDocument/2006/math" xmlns:v="urn:schemas-microsoft-com:vml" xmlns:wp14="http://schemas.microsoft.com/office/word/2010/wordprocessingDrawing" xmlns:wp="http://schemas.openxmlformats.org/drawingml/2006/wordprocessingDrawing" xmlns:w10="urn:schemas-microsoft-com:office:word" xmlns:w="http://schemas.openxmlformats.org/wordprocessingml/2006/main" xmlns:w14="http://schemas.microsoft.com/office/word/2010/wordml" xmlns:wpg="http://schemas.microsoft.com/office/word/2010/wordprocessingGroup" xmlns:wpi="http://schemas.microsoft.com/office/word/2010/wordprocessingInk" xmlns:wne="http://schemas.microsoft.com/office/word/2006/wordml" xmlns:wps="http://schemas.microsoft.com/office/word/2010/wordprocessingShape" mc:Ignorable="w14 wp14">
+<w:document xmlns:wpc="http://schemas.microsoft.com/office/word/2010/wordprocessingCanvas" xmlns:cx="http://schemas.microsoft.com/office/drawing/2014/chartex" xmlns:cx1="http://schemas.microsoft.com/office/drawing/2015/9/8/chartex" xmlns:cx2="http://schemas.microsoft.com/office/drawing/2015/10/21/chartex" xmlns:cx3="http://schemas.microsoft.com/office/drawing/2016/5/9/chartex" xmlns:cx4="http://schemas.microsoft.com/office/drawing/2016/5/10/chartex" xmlns:cx5="http://schemas.microsoft.com/office/drawing/2016/5/11/chartex" xmlns:cx6="http://schemas.microsoft.com/office/drawing/2016/5/12/chartex" xmlns:cx7="http://schemas.microsoft.com/office/drawing/2016/5/13/chartex" xmlns:cx8="http://schemas.microsoft.com/office/drawing/2016/5/14/chartex" xmlns:mc="http://schemas.openxmlformats.org/markup-compatibility/2006" xmlns:aink="http://schemas.microsoft.com/office/drawing/2016/ink" xmlns:am3d="http://schemas.microsoft.com/office/drawing/2017/model3d" xmlns:o="urn:schemas-microsoft-com:office:office" xmlns:oel="http://schemas.microsoft.com/office/2019/extlst" xmlns:r="http://schemas.openxmlformats.org/officeDocument/2006/relationships" xmlns:m="http://schemas.openxmlformats.org/officeDocument/2006/math" xmlns:v="urn:schemas-microsoft-com:vml" xmlns:wp14="http://schemas.microsoft.com/office/word/2010/wordprocessingDrawing" xmlns:wp="http://schemas.openxmlformats.org/drawingml/2006/wordprocessingDrawing" xmlns:w10="urn:schemas-microsoft-com:office:word" xmlns:w="http://schemas.openxmlformats.org/wordprocessingml/2006/main" xmlns:w14="http://schemas.microsoft.com/office/word/2010/wordml" xmlns:w15="http://schemas.microsoft.com/office/word/2012/wordml" xmlns:w16cex="http://schemas.microsoft.com/office/word/2018/wordml/cex" xmlns:w16cid="http://schemas.microsoft.com/office/word/2016/wordml/cid" xmlns:w16="http://schemas.microsoft.com/office/word/2018/wordml" xmlns:w16sdtdh="http://schemas.microsoft.com/office/word/2020/wordml/sdtdatahash" xmlns:w16se="http://schemas.microsoft.com/office/word/2015/wordml/symex" xmlns:wpg="http://schemas.microsoft.com/office/word/2010/wordprocessingGroup" xmlns:wpi="http://schemas.microsoft.com/office/word/2010/wordprocessingInk" xmlns:wne="http://schemas.microsoft.com/office/word/2006/wordml" xmlns:wps="http://schemas.microsoft.com/office/word/2010/wordprocessingShape" mc:Ignorable="w14 w15 w16se w16cid w16 w16cex w16sdtdh wp14">
   <w:body>
     <w:p>
       <w:r>
@@ -26,11 +26,13 @@
     </w:p>
     <w:p>
       <w:r>
-        <w:t xml:space="preserve">Vat No :-  {{partyPan}}</w:t>
-      </w:r>
-    </w:p>
-    <w:p>
-      <w:proofErr w:type="gramStart"/>
+        <w:t>Vat No :-  {{partyPan}}</w:t>
+      </w:r>
+    </w:p>
+    <w:p>
+      <w:r>
+        <w:t xml:space="preserve">                          </w:t>
+      </w:r>
       <w:r>
         <w:t>Subject</w:t>
       </w:r>
@@ -38,11 +40,7 @@
         <w:t xml:space="preserve"> </w:t>
       </w:r>
       <w:r>
-        <w:t>:-</w:t>
-      </w:r>
-      <w:proofErr w:type="gramEnd"/>
-      <w:r>
-        <w:t xml:space="preserve"> Confirmation of Account Balance </w:t>
+        <w:t xml:space="preserve">:- Confirmation of Account Balance </w:t>
       </w:r>
       <w:r>
         <w:t>&amp;</w:t>
@@ -106,11 +104,11 @@
         <w:tblLook w:val="04A0" w:firstRow="1" w:lastRow="0" w:firstColumn="1" w:lastColumn="0" w:noHBand="0" w:noVBand="1"/>
       </w:tblPr>
       <w:tblGrid>
-        <w:gridCol w:w="2836"/>
-        <w:gridCol w:w="1700"/>
-        <w:gridCol w:w="1700"/>
-        <w:gridCol w:w="1700"/>
-        <w:gridCol w:w="1700"/>
+        <w:gridCol w:w="2078"/>
+        <w:gridCol w:w="1981"/>
+        <w:gridCol w:w="1999"/>
+        <w:gridCol w:w="1660"/>
+        <w:gridCol w:w="1918"/>
       </w:tblGrid>
       <w:tr>
         <w:trPr>
@@ -131,83 +129,83 @@
               <w:rPr>
                 <w:b/>
               </w:rPr>
-              <w:t xml:space="preserve">Particulars</w:t>
-            </w:r>
-          </w:p>
-        </w:tc>
-        <w:tc>
-          <w:tcPr>
-            <w:tcW w:w="1700" w:type="dxa"/>
-            <w:vAlign w:val="center"/>
-          </w:tcPr>
-          <w:p>
-            <w:pPr>
-              <w:rPr>
-                <w:b/>
-              </w:rPr>
-            </w:pPr>
-            <w:r>
-              <w:rPr>
-                <w:b/>
-              </w:rPr>
-              <w:t xml:space="preserve">Tax Free Value (Rs)</w:t>
-            </w:r>
-          </w:p>
-        </w:tc>
-        <w:tc>
-          <w:tcPr>
-            <w:tcW w:w="1700" w:type="dxa"/>
-            <w:vAlign w:val="center"/>
-          </w:tcPr>
-          <w:p>
-            <w:pPr>
-              <w:rPr>
-                <w:b/>
-              </w:rPr>
-            </w:pPr>
-            <w:r>
-              <w:rPr>
-                <w:b/>
-              </w:rPr>
-              <w:t xml:space="preserve">Taxable Value (RS)</w:t>
-            </w:r>
-          </w:p>
-        </w:tc>
-        <w:tc>
-          <w:tcPr>
-            <w:tcW w:w="1700" w:type="dxa"/>
-            <w:vAlign w:val="center"/>
-          </w:tcPr>
-          <w:p>
-            <w:pPr>
-              <w:rPr>
-                <w:b/>
-              </w:rPr>
-            </w:pPr>
-            <w:r>
-              <w:rPr>
-                <w:b/>
-              </w:rPr>
-              <w:t xml:space="preserve">Vat (RS)</w:t>
-            </w:r>
-          </w:p>
-        </w:tc>
-        <w:tc>
-          <w:tcPr>
-            <w:tcW w:w="1700" w:type="dxa"/>
-            <w:vAlign w:val="center"/>
-          </w:tcPr>
-          <w:p>
-            <w:pPr>
-              <w:rPr>
-                <w:b/>
-              </w:rPr>
-            </w:pPr>
-            <w:r>
-              <w:rPr>
-                <w:b/>
-              </w:rPr>
-              <w:t xml:space="preserve">Total (RS)</w:t>
+              <w:t>Particulars</w:t>
+            </w:r>
+          </w:p>
+        </w:tc>
+        <w:tc>
+          <w:tcPr>
+            <w:tcW w:w="1700" w:type="dxa"/>
+            <w:vAlign w:val="center"/>
+          </w:tcPr>
+          <w:p>
+            <w:pPr>
+              <w:rPr>
+                <w:b/>
+              </w:rPr>
+            </w:pPr>
+            <w:r>
+              <w:rPr>
+                <w:b/>
+              </w:rPr>
+              <w:t>Tax Free Value (Rs)</w:t>
+            </w:r>
+          </w:p>
+        </w:tc>
+        <w:tc>
+          <w:tcPr>
+            <w:tcW w:w="1700" w:type="dxa"/>
+            <w:vAlign w:val="center"/>
+          </w:tcPr>
+          <w:p>
+            <w:pPr>
+              <w:rPr>
+                <w:b/>
+              </w:rPr>
+            </w:pPr>
+            <w:r>
+              <w:rPr>
+                <w:b/>
+              </w:rPr>
+              <w:t>Taxable Value (RS)</w:t>
+            </w:r>
+          </w:p>
+        </w:tc>
+        <w:tc>
+          <w:tcPr>
+            <w:tcW w:w="1700" w:type="dxa"/>
+            <w:vAlign w:val="center"/>
+          </w:tcPr>
+          <w:p>
+            <w:pPr>
+              <w:rPr>
+                <w:b/>
+              </w:rPr>
+            </w:pPr>
+            <w:r>
+              <w:rPr>
+                <w:b/>
+              </w:rPr>
+              <w:t>Vat (RS)</w:t>
+            </w:r>
+          </w:p>
+        </w:tc>
+        <w:tc>
+          <w:tcPr>
+            <w:tcW w:w="1700" w:type="dxa"/>
+            <w:vAlign w:val="center"/>
+          </w:tcPr>
+          <w:p>
+            <w:pPr>
+              <w:rPr>
+                <w:b/>
+              </w:rPr>
+            </w:pPr>
+            <w:r>
+              <w:rPr>
+                <w:b/>
+              </w:rPr>
+              <w:t>Total (RS)</w:t>
             </w:r>
           </w:p>
         </w:tc>
@@ -231,7 +229,7 @@
               <w:rPr>
                 <w:b/>
               </w:rPr>
-              <w:t xml:space="preserve">Opening Balance</w:t>
+              <w:t>Opening Balance</w:t>
             </w:r>
           </w:p>
         </w:tc>
@@ -245,7 +243,7 @@
               <w:jc w:val="right"/>
             </w:pPr>
             <w:r>
-              <w:t xml:space="preserve">{{openingTaxfree}}</w:t>
+              <w:t>{{openingTaxfree}}</w:t>
             </w:r>
           </w:p>
         </w:tc>
@@ -259,7 +257,7 @@
               <w:jc w:val="right"/>
             </w:pPr>
             <w:r>
-              <w:t xml:space="preserve">{{openingTaxable}}</w:t>
+              <w:t>{{openingTaxable}}</w:t>
             </w:r>
           </w:p>
         </w:tc>
@@ -273,7 +271,7 @@
               <w:jc w:val="right"/>
             </w:pPr>
             <w:r>
-              <w:t xml:space="preserve">{{openingVat}}</w:t>
+              <w:t>{{openingVat}}</w:t>
             </w:r>
           </w:p>
         </w:tc>
@@ -287,7 +285,7 @@
               <w:jc w:val="right"/>
             </w:pPr>
             <w:r>
-              <w:t xml:space="preserve">{{openingBalance}}</w:t>
+              <w:t>{{openingBalance}}</w:t>
             </w:r>
           </w:p>
         </w:tc>
@@ -311,7 +309,7 @@
               <w:rPr>
                 <w:b/>
               </w:rPr>
-              <w:t xml:space="preserve">Sales</w:t>
+              <w:t>Sales</w:t>
             </w:r>
           </w:p>
         </w:tc>
@@ -325,7 +323,7 @@
               <w:jc w:val="right"/>
             </w:pPr>
             <w:r>
-              <w:t xml:space="preserve">{{salesTaxfree}}</w:t>
+              <w:t>{{salesTaxfree}}</w:t>
             </w:r>
           </w:p>
         </w:tc>
@@ -339,7 +337,7 @@
               <w:jc w:val="right"/>
             </w:pPr>
             <w:r>
-              <w:t xml:space="preserve">{{salesTaxable}}</w:t>
+              <w:t>{{salesTaxable}}</w:t>
             </w:r>
           </w:p>
         </w:tc>
@@ -353,7 +351,7 @@
               <w:jc w:val="right"/>
             </w:pPr>
             <w:r>
-              <w:t xml:space="preserve">{{salesVat}}</w:t>
+              <w:t>{{salesVat}}</w:t>
             </w:r>
           </w:p>
         </w:tc>
@@ -367,7 +365,7 @@
               <w:jc w:val="right"/>
             </w:pPr>
             <w:r>
-              <w:t xml:space="preserve">{{salesTotal}}</w:t>
+              <w:t>{{salesTotal}}</w:t>
             </w:r>
           </w:p>
         </w:tc>
@@ -391,7 +389,7 @@
               <w:rPr>
                 <w:b/>
               </w:rPr>
-              <w:t xml:space="preserve">Purchase</w:t>
+              <w:t>Purchase</w:t>
             </w:r>
           </w:p>
         </w:tc>
@@ -405,7 +403,7 @@
               <w:jc w:val="right"/>
             </w:pPr>
             <w:r>
-              <w:t xml:space="preserve">{{purchaseTaxfree}}</w:t>
+              <w:t>{{purchaseTaxfree}}</w:t>
             </w:r>
           </w:p>
         </w:tc>
@@ -419,7 +417,7 @@
               <w:jc w:val="right"/>
             </w:pPr>
             <w:r>
-              <w:t xml:space="preserve">{{purchaseTaxable}}</w:t>
+              <w:t>{{purchaseTaxable}}</w:t>
             </w:r>
           </w:p>
         </w:tc>
@@ -433,7 +431,7 @@
               <w:jc w:val="right"/>
             </w:pPr>
             <w:r>
-              <w:t xml:space="preserve">{{purchaseVat}}</w:t>
+              <w:t>{{purchaseVat}}</w:t>
             </w:r>
           </w:p>
         </w:tc>
@@ -447,7 +445,7 @@
               <w:jc w:val="right"/>
             </w:pPr>
             <w:r>
-              <w:t xml:space="preserve">{{purchaseTotal}}</w:t>
+              <w:t>{{purchaseTotal}}</w:t>
             </w:r>
           </w:p>
         </w:tc>
@@ -471,7 +469,7 @@
               <w:rPr>
                 <w:b/>
               </w:rPr>
-              <w:t xml:space="preserve">Closing Balance (Dr)</w:t>
+              <w:t>Closing Balance (Dr)</w:t>
             </w:r>
           </w:p>
         </w:tc>
@@ -485,7 +483,7 @@
               <w:jc w:val="right"/>
             </w:pPr>
             <w:r>
-              <w:t xml:space="preserve">{{closingTaxfree}}</w:t>
+              <w:t>{{closingTaxfree}}</w:t>
             </w:r>
           </w:p>
         </w:tc>
@@ -499,7 +497,7 @@
               <w:jc w:val="right"/>
             </w:pPr>
             <w:r>
-              <w:t xml:space="preserve">{{closingTaxable}}</w:t>
+              <w:t>{{closingTaxable}}</w:t>
             </w:r>
           </w:p>
         </w:tc>
@@ -513,7 +511,7 @@
               <w:jc w:val="right"/>
             </w:pPr>
             <w:r>
-              <w:t xml:space="preserve">{{closingVat}}</w:t>
+              <w:t>{{closingVat}}</w:t>
             </w:r>
           </w:p>
         </w:tc>
@@ -527,7 +525,7 @@
               <w:jc w:val="right"/>
             </w:pPr>
             <w:r>
-              <w:t xml:space="preserve">{{closingBalance}}</w:t>
+              <w:t>{{closingBalance}}</w:t>
             </w:r>
           </w:p>
         </w:tc>
@@ -553,15 +551,7 @@
         <w:t>For any query regarding books of a</w:t>
       </w:r>
       <w:r>
-        <w:t xml:space="preserve">ccount, please </w:t>
-      </w:r>
-      <w:proofErr w:type="gramStart"/>
-      <w:r>
-        <w:t>contact ,</w:t>
-      </w:r>
-      <w:proofErr w:type="gramEnd"/>
-      <w:r>
-        <w:t xml:space="preserve"> Phone </w:t>
+        <w:t xml:space="preserve">ccount, please contact , Phone </w:t>
       </w:r>
       <w:r>
         <w:t xml:space="preserve"> no:-</w:t>
@@ -618,7 +608,13 @@
         <w:t xml:space="preserve">…………………………………     </w:t>
       </w:r>
       <w:r>
-        <w:t xml:space="preserve">                                                                                       …………………………….</w:t>
+        <w:t xml:space="preserve">                                                                                      </w:t>
+      </w:r>
+      <w:r>
+        <w:t xml:space="preserve">      </w:t>
+      </w:r>
+      <w:r>
+        <w:t xml:space="preserve"> …………………………….</w:t>
       </w:r>
       <w:r>
         <w:tab/>
@@ -637,13 +633,8 @@
         <w:t xml:space="preserve">Authorized Signature   </w:t>
       </w:r>
       <w:r>
-        <w:t xml:space="preserve">                                                                                                 </w:t>
-      </w:r>
-      <w:proofErr w:type="spellStart"/>
-      <w:r>
-        <w:t>Receiver Signature</w:t>
-      </w:r>
-      <w:proofErr w:type="spellEnd"/>
+        <w:t xml:space="preserve">                                                                                                 Receiver Signature</w:t>
+      </w:r>
       <w:r>
         <w:t xml:space="preserve">                                                                                                               </w:t>
       </w:r>
@@ -659,13 +650,8 @@
         </w:tabs>
       </w:pPr>
       <w:r>
-        <w:t xml:space="preserve">  </w:t>
-      </w:r>
-      <w:proofErr w:type="gramStart"/>
-      <w:r>
-        <w:t>Stamp :-</w:t>
-      </w:r>
-      <w:proofErr w:type="gramEnd"/>
+        <w:t xml:space="preserve">  Stamp :-</w:t>
+      </w:r>
       <w:r>
         <w:tab/>
       </w:r>
@@ -676,7 +662,13 @@
         <w:t xml:space="preserve">                        </w:t>
       </w:r>
       <w:r>
-        <w:t xml:space="preserve">   Pan No.</w:t>
+        <w:t xml:space="preserve"> </w:t>
+      </w:r>
+      <w:r>
+        <w:t xml:space="preserve">     </w:t>
+      </w:r>
+      <w:r>
+        <w:t xml:space="preserve"> Pan No.</w:t>
       </w:r>
       <w:r>
         <w:t>:-</w:t>
@@ -698,6 +690,9 @@
         <w:t xml:space="preserve">                            </w:t>
       </w:r>
       <w:r>
+        <w:t xml:space="preserve">   </w:t>
+      </w:r>
+      <w:r>
         <w:t xml:space="preserve"> </w:t>
       </w:r>
       <w:r>
@@ -706,6 +701,7 @@
     </w:p>
     <w:p>
       <w:r>
+        <w:lastRenderedPageBreak/>
         <w:t>{{^last}}</w:t>
       </w:r>
     </w:p>
@@ -716,6 +712,7 @@
     </w:p>
     <w:p>
       <w:r>
+        <w:lastRenderedPageBreak/>
         <w:t>{{/last}}</w:t>
       </w:r>
     </w:p>
@@ -725,7 +722,7 @@
       </w:r>
     </w:p>
     <w:sectPr>
-      <w:headerReference w:type="default" r:id="rId7"/>
+      <w:headerReference w:type="default" r:id="rId6"/>
       <w:pgSz w:w="12240" w:h="15840"/>
       <w:pgMar w:top="1440" w:right="1440" w:bottom="1440" w:left="1440" w:header="720" w:footer="720" w:gutter="0"/>
       <w:cols w:space="720"/>
@@ -736,7 +733,7 @@
 </file>
 
 <file path=word/endnotes.xml><?xml version="1.0" encoding="utf-8"?>
-<w:endnotes xmlns:wpc="http://schemas.microsoft.com/office/word/2010/wordprocessingCanvas" xmlns:mc="http://schemas.openxmlformats.org/markup-compatibility/2006" xmlns:o="urn:schemas-microsoft-com:office:office" xmlns:r="http://schemas.openxmlformats.org/officeDocument/2006/relationships" xmlns:m="http://schemas.openxmlformats.org/officeDocument/2006/math" xmlns:v="urn:schemas-microsoft-com:vml" xmlns:wp14="http://schemas.microsoft.com/office/word/2010/wordprocessingDrawing" xmlns:wp="http://schemas.openxmlformats.org/drawingml/2006/wordprocessingDrawing" xmlns:w10="urn:schemas-microsoft-com:office:word" xmlns:w="http://schemas.openxmlformats.org/wordprocessingml/2006/main" xmlns:w14="http://schemas.microsoft.com/office/word/2010/wordml" xmlns:wpg="http://schemas.microsoft.com/office/word/2010/wordprocessingGroup" xmlns:wpi="http://schemas.microsoft.com/office/word/2010/wordprocessingInk" xmlns:wne="http://schemas.microsoft.com/office/word/2006/wordml" xmlns:wps="http://schemas.microsoft.com/office/word/2010/wordprocessingShape" mc:Ignorable="w14 wp14">
+<w:endnotes xmlns:wpc="http://schemas.microsoft.com/office/word/2010/wordprocessingCanvas" xmlns:cx="http://schemas.microsoft.com/office/drawing/2014/chartex" xmlns:cx1="http://schemas.microsoft.com/office/drawing/2015/9/8/chartex" xmlns:cx2="http://schemas.microsoft.com/office/drawing/2015/10/21/chartex" xmlns:cx3="http://schemas.microsoft.com/office/drawing/2016/5/9/chartex" xmlns:cx4="http://schemas.microsoft.com/office/drawing/2016/5/10/chartex" xmlns:cx5="http://schemas.microsoft.com/office/drawing/2016/5/11/chartex" xmlns:cx6="http://schemas.microsoft.com/office/drawing/2016/5/12/chartex" xmlns:cx7="http://schemas.microsoft.com/office/drawing/2016/5/13/chartex" xmlns:cx8="http://schemas.microsoft.com/office/drawing/2016/5/14/chartex" xmlns:mc="http://schemas.openxmlformats.org/markup-compatibility/2006" xmlns:aink="http://schemas.microsoft.com/office/drawing/2016/ink" xmlns:am3d="http://schemas.microsoft.com/office/drawing/2017/model3d" xmlns:o="urn:schemas-microsoft-com:office:office" xmlns:oel="http://schemas.microsoft.com/office/2019/extlst" xmlns:r="http://schemas.openxmlformats.org/officeDocument/2006/relationships" xmlns:m="http://schemas.openxmlformats.org/officeDocument/2006/math" xmlns:v="urn:schemas-microsoft-com:vml" xmlns:wp14="http://schemas.microsoft.com/office/word/2010/wordprocessingDrawing" xmlns:wp="http://schemas.openxmlformats.org/drawingml/2006/wordprocessingDrawing" xmlns:w10="urn:schemas-microsoft-com:office:word" xmlns:w="http://schemas.openxmlformats.org/wordprocessingml/2006/main" xmlns:w14="http://schemas.microsoft.com/office/word/2010/wordml" xmlns:w15="http://schemas.microsoft.com/office/word/2012/wordml" xmlns:w16cex="http://schemas.microsoft.com/office/word/2018/wordml/cex" xmlns:w16cid="http://schemas.microsoft.com/office/word/2016/wordml/cid" xmlns:w16="http://schemas.microsoft.com/office/word/2018/wordml" xmlns:w16sdtdh="http://schemas.microsoft.com/office/word/2020/wordml/sdtdatahash" xmlns:w16se="http://schemas.microsoft.com/office/word/2015/wordml/symex" xmlns:wpg="http://schemas.microsoft.com/office/word/2010/wordprocessingGroup" xmlns:wpi="http://schemas.microsoft.com/office/word/2010/wordprocessingInk" xmlns:wne="http://schemas.microsoft.com/office/word/2006/wordml" xmlns:wps="http://schemas.microsoft.com/office/word/2010/wordprocessingShape" mc:Ignorable="w14 w15 w16se w16cid w16 w16cex w16sdtdh wp14">
   <w:endnote w:type="separator" w:id="-1">
     <w:p>
       <w:pPr>
@@ -761,7 +758,7 @@
 </file>
 
 <file path=word/footnotes.xml><?xml version="1.0" encoding="utf-8"?>
-<w:footnotes xmlns:wpc="http://schemas.microsoft.com/office/word/2010/wordprocessingCanvas" xmlns:mc="http://schemas.openxmlformats.org/markup-compatibility/2006" xmlns:o="urn:schemas-microsoft-com:office:office" xmlns:r="http://schemas.openxmlformats.org/officeDocument/2006/relationships" xmlns:m="http://schemas.openxmlformats.org/officeDocument/2006/math" xmlns:v="urn:schemas-microsoft-com:vml" xmlns:wp14="http://schemas.microsoft.com/office/word/2010/wordprocessingDrawing" xmlns:wp="http://schemas.openxmlformats.org/drawingml/2006/wordprocessingDrawing" xmlns:w10="urn:schemas-microsoft-com:office:word" xmlns:w="http://schemas.openxmlformats.org/wordprocessingml/2006/main" xmlns:w14="http://schemas.microsoft.com/office/word/2010/wordml" xmlns:wpg="http://schemas.microsoft.com/office/word/2010/wordprocessingGroup" xmlns:wpi="http://schemas.microsoft.com/office/word/2010/wordprocessingInk" xmlns:wne="http://schemas.microsoft.com/office/word/2006/wordml" xmlns:wps="http://schemas.microsoft.com/office/word/2010/wordprocessingShape" mc:Ignorable="w14 wp14">
+<w:footnotes xmlns:wpc="http://schemas.microsoft.com/office/word/2010/wordprocessingCanvas" xmlns:cx="http://schemas.microsoft.com/office/drawing/2014/chartex" xmlns:cx1="http://schemas.microsoft.com/office/drawing/2015/9/8/chartex" xmlns:cx2="http://schemas.microsoft.com/office/drawing/2015/10/21/chartex" xmlns:cx3="http://schemas.microsoft.com/office/drawing/2016/5/9/chartex" xmlns:cx4="http://schemas.microsoft.com/office/drawing/2016/5/10/chartex" xmlns:cx5="http://schemas.microsoft.com/office/drawing/2016/5/11/chartex" xmlns:cx6="http://schemas.microsoft.com/office/drawing/2016/5/12/chartex" xmlns:cx7="http://schemas.microsoft.com/office/drawing/2016/5/13/chartex" xmlns:cx8="http://schemas.microsoft.com/office/drawing/2016/5/14/chartex" xmlns:mc="http://schemas.openxmlformats.org/markup-compatibility/2006" xmlns:aink="http://schemas.microsoft.com/office/drawing/2016/ink" xmlns:am3d="http://schemas.microsoft.com/office/drawing/2017/model3d" xmlns:o="urn:schemas-microsoft-com:office:office" xmlns:oel="http://schemas.microsoft.com/office/2019/extlst" xmlns:r="http://schemas.openxmlformats.org/officeDocument/2006/relationships" xmlns:m="http://schemas.openxmlformats.org/officeDocument/2006/math" xmlns:v="urn:schemas-microsoft-com:vml" xmlns:wp14="http://schemas.microsoft.com/office/word/2010/wordprocessingDrawing" xmlns:wp="http://schemas.openxmlformats.org/drawingml/2006/wordprocessingDrawing" xmlns:w10="urn:schemas-microsoft-com:office:word" xmlns:w="http://schemas.openxmlformats.org/wordprocessingml/2006/main" xmlns:w14="http://schemas.microsoft.com/office/word/2010/wordml" xmlns:w15="http://schemas.microsoft.com/office/word/2012/wordml" xmlns:w16cex="http://schemas.microsoft.com/office/word/2018/wordml/cex" xmlns:w16cid="http://schemas.microsoft.com/office/word/2016/wordml/cid" xmlns:w16="http://schemas.microsoft.com/office/word/2018/wordml" xmlns:w16sdtdh="http://schemas.microsoft.com/office/word/2020/wordml/sdtdatahash" xmlns:w16se="http://schemas.microsoft.com/office/word/2015/wordml/symex" xmlns:wpg="http://schemas.microsoft.com/office/word/2010/wordprocessingGroup" xmlns:wpi="http://schemas.microsoft.com/office/word/2010/wordprocessingInk" xmlns:wne="http://schemas.microsoft.com/office/word/2006/wordml" xmlns:wps="http://schemas.microsoft.com/office/word/2010/wordprocessingShape" mc:Ignorable="w14 w15 w16se w16cid w16 w16cex w16sdtdh wp14">
   <w:footnote w:type="separator" w:id="-1">
     <w:p>
       <w:pPr>
@@ -786,7 +783,7 @@
 </file>
 
 <file path=word/header1.xml><?xml version="1.0" encoding="utf-8"?>
-<w:hdr xmlns:wpc="http://schemas.microsoft.com/office/word/2010/wordprocessingCanvas" xmlns:mc="http://schemas.openxmlformats.org/markup-compatibility/2006" xmlns:o="urn:schemas-microsoft-com:office:office" xmlns:r="http://schemas.openxmlformats.org/officeDocument/2006/relationships" xmlns:m="http://schemas.openxmlformats.org/officeDocument/2006/math" xmlns:v="urn:schemas-microsoft-com:vml" xmlns:wp14="http://schemas.microsoft.com/office/word/2010/wordprocessingDrawing" xmlns:wp="http://schemas.openxmlformats.org/drawingml/2006/wordprocessingDrawing" xmlns:w10="urn:schemas-microsoft-com:office:word" xmlns:w="http://schemas.openxmlformats.org/wordprocessingml/2006/main" xmlns:w14="http://schemas.microsoft.com/office/word/2010/wordml" xmlns:wpg="http://schemas.microsoft.com/office/word/2010/wordprocessingGroup" xmlns:wpi="http://schemas.microsoft.com/office/word/2010/wordprocessingInk" xmlns:wne="http://schemas.microsoft.com/office/word/2006/wordml" xmlns:wps="http://schemas.microsoft.com/office/word/2010/wordprocessingShape" mc:Ignorable="w14 wp14">
+<w:hdr xmlns:wpc="http://schemas.microsoft.com/office/word/2010/wordprocessingCanvas" xmlns:cx="http://schemas.microsoft.com/office/drawing/2014/chartex" xmlns:cx1="http://schemas.microsoft.com/office/drawing/2015/9/8/chartex" xmlns:cx2="http://schemas.microsoft.com/office/drawing/2015/10/21/chartex" xmlns:cx3="http://schemas.microsoft.com/office/drawing/2016/5/9/chartex" xmlns:cx4="http://schemas.microsoft.com/office/drawing/2016/5/10/chartex" xmlns:cx5="http://schemas.microsoft.com/office/drawing/2016/5/11/chartex" xmlns:cx6="http://schemas.microsoft.com/office/drawing/2016/5/12/chartex" xmlns:cx7="http://schemas.microsoft.com/office/drawing/2016/5/13/chartex" xmlns:cx8="http://schemas.microsoft.com/office/drawing/2016/5/14/chartex" xmlns:mc="http://schemas.openxmlformats.org/markup-compatibility/2006" xmlns:aink="http://schemas.microsoft.com/office/drawing/2016/ink" xmlns:am3d="http://schemas.microsoft.com/office/drawing/2017/model3d" xmlns:o="urn:schemas-microsoft-com:office:office" xmlns:oel="http://schemas.microsoft.com/office/2019/extlst" xmlns:r="http://schemas.openxmlformats.org/officeDocument/2006/relationships" xmlns:m="http://schemas.openxmlformats.org/officeDocument/2006/math" xmlns:v="urn:schemas-microsoft-com:vml" xmlns:wp14="http://schemas.microsoft.com/office/word/2010/wordprocessingDrawing" xmlns:wp="http://schemas.openxmlformats.org/drawingml/2006/wordprocessingDrawing" xmlns:w10="urn:schemas-microsoft-com:office:word" xmlns:w="http://schemas.openxmlformats.org/wordprocessingml/2006/main" xmlns:w14="http://schemas.microsoft.com/office/word/2010/wordml" xmlns:w15="http://schemas.microsoft.com/office/word/2012/wordml" xmlns:w16cex="http://schemas.microsoft.com/office/word/2018/wordml/cex" xmlns:w16cid="http://schemas.microsoft.com/office/word/2016/wordml/cid" xmlns:w16="http://schemas.microsoft.com/office/word/2018/wordml" xmlns:w16sdtdh="http://schemas.microsoft.com/office/word/2020/wordml/sdtdatahash" xmlns:w16se="http://schemas.microsoft.com/office/word/2015/wordml/symex" xmlns:wpg="http://schemas.microsoft.com/office/word/2010/wordprocessingGroup" xmlns:wpi="http://schemas.microsoft.com/office/word/2010/wordprocessingInk" xmlns:wne="http://schemas.microsoft.com/office/word/2006/wordml" xmlns:wps="http://schemas.microsoft.com/office/word/2010/wordprocessingShape" mc:Ignorable="w14 w15 w16se w16cid w16 w16cex w16sdtdh wp14">
   <w:p>
     <w:pPr>
       <w:jc w:val="center"/>
@@ -796,7 +793,7 @@
         <w:b/>
         <w:sz w:val="40"/>
       </w:rPr>
-      <w:t xml:space="preserve">{{firmName}}</w:t>
+      <w:t>{{firmName}}</w:t>
     </w:r>
   </w:p>
   <w:p>
@@ -807,7 +804,7 @@
       <w:rPr>
         <w:sz w:val="30"/>
       </w:rPr>
-      <w:t xml:space="preserve">{{firmAddress}}</w:t>
+      <w:t>{{firmAddress}}</w:t>
     </w:r>
   </w:p>
   <w:p>
@@ -819,42 +816,39 @@
     <w:r>
       <w:rPr>
         <w:b/>
-        <w:sz w:val="22"/>
       </w:rPr>
-      <w:t xml:space="preserve">Pan No:-  {{firmPan}}</w:t>
+      <w:t>Pan No:-  {{firmPan}}</w:t>
     </w:r>
     <w:r>
       <w:rPr>
         <w:b/>
-        <w:sz w:val="22"/>
       </w:rPr>
       <w:tab/>
-      <w:t xml:space="preserve">Phone No:-  {{firmPhone}}</w:t>
+      <w:t>Phone No:-  {{firmPhone}}</w:t>
     </w:r>
   </w:p>
   <w:p>
     <w:pPr>
+      <w:pBdr>
+        <w:bottom w:val="single" w:sz="24" w:space="6" w:color="000000"/>
+      </w:pBdr>
       <w:tabs>
         <w:tab w:val="left" w:pos="5400"/>
       </w:tabs>
-      <w:pBdr>
-        <w:bottom w:val="single" w:sz="24" w:space="6" w:color="000000"/>
-      </w:pBdr>
     </w:pPr>
     <w:r>
       <w:rPr>
         <w:b/>
-        <w:sz w:val="22"/>
       </w:rPr>
       <w:tab/>
-      <w:t xml:space="preserve">Date:-  {{letterDate}}</w:t>
+      <w:t>Date:-  {{letterDate}}</w:t>
     </w:r>
   </w:p>
 </w:hdr>
 </file>
 
 <file path=word/styles.xml><?xml version="1.0" encoding="utf-8"?>
-<w:styles xmlns:mc="http://schemas.openxmlformats.org/markup-compatibility/2006" xmlns:r="http://schemas.openxmlformats.org/officeDocument/2006/relationships" xmlns:w="http://schemas.openxmlformats.org/wordprocessingml/2006/main" xmlns:w14="http://schemas.microsoft.com/office/word/2010/wordml" mc:Ignorable="w14">
+<w:styles xmlns:mc="http://schemas.openxmlformats.org/markup-compatibility/2006" xmlns:r="http://schemas.openxmlformats.org/officeDocument/2006/relationships" xmlns:w="http://schemas.openxmlformats.org/wordprocessingml/2006/main" xmlns:w14="http://schemas.microsoft.com/office/word/2010/wordml" xmlns:w15="http://schemas.microsoft.com/office/word/2012/wordml" xmlns:w16cex="http://schemas.microsoft.com/office/word/2018/wordml/cex" xmlns:w16cid="http://schemas.microsoft.com/office/word/2016/wordml/cid" xmlns:w16="http://schemas.microsoft.com/office/word/2018/wordml" xmlns:w16sdtdh="http://schemas.microsoft.com/office/word/2020/wordml/sdtdatahash" xmlns:w16se="http://schemas.microsoft.com/office/word/2015/wordml/symex" mc:Ignorable="w14 w15 w16se w16cid w16 w16cex w16sdtdh">
   <w:docDefaults>
     <w:rPrDefault>
       <w:rPr>
@@ -870,144 +864,383 @@
       </w:pPr>
     </w:pPrDefault>
   </w:docDefaults>
-  <w:latentStyles w:defLockedState="0" w:defUIPriority="99" w:defSemiHidden="1" w:defUnhideWhenUsed="1" w:defQFormat="0" w:count="267">
-    <w:lsdException w:name="Normal" w:semiHidden="0" w:uiPriority="0" w:unhideWhenUsed="0" w:qFormat="1"/>
-    <w:lsdException w:name="heading 1" w:semiHidden="0" w:uiPriority="9" w:unhideWhenUsed="0" w:qFormat="1"/>
-    <w:lsdException w:name="heading 2" w:uiPriority="9" w:qFormat="1"/>
-    <w:lsdException w:name="heading 3" w:uiPriority="9" w:qFormat="1"/>
-    <w:lsdException w:name="heading 4" w:uiPriority="9" w:qFormat="1"/>
-    <w:lsdException w:name="heading 5" w:uiPriority="9" w:qFormat="1"/>
-    <w:lsdException w:name="heading 6" w:uiPriority="9" w:qFormat="1"/>
-    <w:lsdException w:name="heading 7" w:uiPriority="9" w:qFormat="1"/>
-    <w:lsdException w:name="heading 8" w:uiPriority="9" w:qFormat="1"/>
-    <w:lsdException w:name="heading 9" w:uiPriority="9" w:qFormat="1"/>
-    <w:lsdException w:name="toc 1" w:uiPriority="39"/>
-    <w:lsdException w:name="toc 2" w:uiPriority="39"/>
-    <w:lsdException w:name="toc 3" w:uiPriority="39"/>
-    <w:lsdException w:name="toc 4" w:uiPriority="39"/>
-    <w:lsdException w:name="toc 5" w:uiPriority="39"/>
-    <w:lsdException w:name="toc 6" w:uiPriority="39"/>
-    <w:lsdException w:name="toc 7" w:uiPriority="39"/>
-    <w:lsdException w:name="toc 8" w:uiPriority="39"/>
-    <w:lsdException w:name="toc 9" w:uiPriority="39"/>
-    <w:lsdException w:name="caption" w:uiPriority="35" w:qFormat="1"/>
-    <w:lsdException w:name="Title" w:semiHidden="0" w:uiPriority="10" w:unhideWhenUsed="0" w:qFormat="1"/>
-    <w:lsdException w:name="Default Paragraph Font" w:uiPriority="1"/>
-    <w:lsdException w:name="Subtitle" w:semiHidden="0" w:uiPriority="11" w:unhideWhenUsed="0" w:qFormat="1"/>
-    <w:lsdException w:name="Strong" w:semiHidden="0" w:uiPriority="22" w:unhideWhenUsed="0" w:qFormat="1"/>
-    <w:lsdException w:name="Emphasis" w:semiHidden="0" w:uiPriority="20" w:unhideWhenUsed="0" w:qFormat="1"/>
-    <w:lsdException w:name="Table Grid" w:semiHidden="0" w:uiPriority="59" w:unhideWhenUsed="0"/>
-    <w:lsdException w:name="Placeholder Text" w:unhideWhenUsed="0"/>
-    <w:lsdException w:name="No Spacing" w:semiHidden="0" w:uiPriority="1" w:unhideWhenUsed="0" w:qFormat="1"/>
-    <w:lsdException w:name="Light Shading" w:semiHidden="0" w:uiPriority="60" w:unhideWhenUsed="0"/>
-    <w:lsdException w:name="Light List" w:semiHidden="0" w:uiPriority="61" w:unhideWhenUsed="0"/>
-    <w:lsdException w:name="Light Grid" w:semiHidden="0" w:uiPriority="62" w:unhideWhenUsed="0"/>
-    <w:lsdException w:name="Medium Shading 1" w:semiHidden="0" w:uiPriority="63" w:unhideWhenUsed="0"/>
-    <w:lsdException w:name="Medium Shading 2" w:semiHidden="0" w:uiPriority="64" w:unhideWhenUsed="0"/>
-    <w:lsdException w:name="Medium List 1" w:semiHidden="0" w:uiPriority="65" w:unhideWhenUsed="0"/>
-    <w:lsdException w:name="Medium List 2" w:semiHidden="0" w:uiPriority="66" w:unhideWhenUsed="0"/>
-    <w:lsdException w:name="Medium Grid 1" w:semiHidden="0" w:uiPriority="67" w:unhideWhenUsed="0"/>
-    <w:lsdException w:name="Medium Grid 2" w:semiHidden="0" w:uiPriority="68" w:unhideWhenUsed="0"/>
-    <w:lsdException w:name="Medium Grid 3" w:semiHidden="0" w:uiPriority="69" w:unhideWhenUsed="0"/>
-    <w:lsdException w:name="Dark List" w:semiHidden="0" w:uiPriority="70" w:unhideWhenUsed="0"/>
-    <w:lsdException w:name="Colorful Shading" w:semiHidden="0" w:uiPriority="71" w:unhideWhenUsed="0"/>
-    <w:lsdException w:name="Colorful List" w:semiHidden="0" w:uiPriority="72" w:unhideWhenUsed="0"/>
-    <w:lsdException w:name="Colorful Grid" w:semiHidden="0" w:uiPriority="73" w:unhideWhenUsed="0"/>
-    <w:lsdException w:name="Light Shading Accent 1" w:semiHidden="0" w:uiPriority="60" w:unhideWhenUsed="0"/>
-    <w:lsdException w:name="Light List Accent 1" w:semiHidden="0" w:uiPriority="61" w:unhideWhenUsed="0"/>
-    <w:lsdException w:name="Light Grid Accent 1" w:semiHidden="0" w:uiPriority="62" w:unhideWhenUsed="0"/>
-    <w:lsdException w:name="Medium Shading 1 Accent 1" w:semiHidden="0" w:uiPriority="63" w:unhideWhenUsed="0"/>
-    <w:lsdException w:name="Medium Shading 2 Accent 1" w:semiHidden="0" w:uiPriority="64" w:unhideWhenUsed="0"/>
-    <w:lsdException w:name="Medium List 1 Accent 1" w:semiHidden="0" w:uiPriority="65" w:unhideWhenUsed="0"/>
-    <w:lsdException w:name="Revision" w:unhideWhenUsed="0"/>
-    <w:lsdException w:name="List Paragraph" w:semiHidden="0" w:uiPriority="34" w:unhideWhenUsed="0" w:qFormat="1"/>
-    <w:lsdException w:name="Quote" w:semiHidden="0" w:uiPriority="29" w:unhideWhenUsed="0" w:qFormat="1"/>
-    <w:lsdException w:name="Intense Quote" w:semiHidden="0" w:uiPriority="30" w:unhideWhenUsed="0" w:qFormat="1"/>
-    <w:lsdException w:name="Medium List 2 Accent 1" w:semiHidden="0" w:uiPriority="66" w:unhideWhenUsed="0"/>
-    <w:lsdException w:name="Medium Grid 1 Accent 1" w:semiHidden="0" w:uiPriority="67" w:unhideWhenUsed="0"/>
-    <w:lsdException w:name="Medium Grid 2 Accent 1" w:semiHidden="0" w:uiPriority="68" w:unhideWhenUsed="0"/>
-    <w:lsdException w:name="Medium Grid 3 Accent 1" w:semiHidden="0" w:uiPriority="69" w:unhideWhenUsed="0"/>
-    <w:lsdException w:name="Dark List Accent 1" w:semiHidden="0" w:uiPriority="70" w:unhideWhenUsed="0"/>
-    <w:lsdException w:name="Colorful Shading Accent 1" w:semiHidden="0" w:uiPriority="71" w:unhideWhenUsed="0"/>
-    <w:lsdException w:name="Colorful List Accent 1" w:semiHidden="0" w:uiPriority="72" w:unhideWhenUsed="0"/>
-    <w:lsdException w:name="Colorful Grid Accent 1" w:semiHidden="0" w:uiPriority="73" w:unhideWhenUsed="0"/>
-    <w:lsdException w:name="Light Shading Accent 2" w:semiHidden="0" w:uiPriority="60" w:unhideWhenUsed="0"/>
-    <w:lsdException w:name="Light List Accent 2" w:semiHidden="0" w:uiPriority="61" w:unhideWhenUsed="0"/>
-    <w:lsdException w:name="Light Grid Accent 2" w:semiHidden="0" w:uiPriority="62" w:unhideWhenUsed="0"/>
-    <w:lsdException w:name="Medium Shading 1 Accent 2" w:semiHidden="0" w:uiPriority="63" w:unhideWhenUsed="0"/>
-    <w:lsdException w:name="Medium Shading 2 Accent 2" w:semiHidden="0" w:uiPriority="64" w:unhideWhenUsed="0"/>
-    <w:lsdException w:name="Medium List 1 Accent 2" w:semiHidden="0" w:uiPriority="65" w:unhideWhenUsed="0"/>
-    <w:lsdException w:name="Medium List 2 Accent 2" w:semiHidden="0" w:uiPriority="66" w:unhideWhenUsed="0"/>
-    <w:lsdException w:name="Medium Grid 1 Accent 2" w:semiHidden="0" w:uiPriority="67" w:unhideWhenUsed="0"/>
-    <w:lsdException w:name="Medium Grid 2 Accent 2" w:semiHidden="0" w:uiPriority="68" w:unhideWhenUsed="0"/>
-    <w:lsdException w:name="Medium Grid 3 Accent 2" w:semiHidden="0" w:uiPriority="69" w:unhideWhenUsed="0"/>
-    <w:lsdException w:name="Dark List Accent 2" w:semiHidden="0" w:uiPriority="70" w:unhideWhenUsed="0"/>
-    <w:lsdException w:name="Colorful Shading Accent 2" w:semiHidden="0" w:uiPriority="71" w:unhideWhenUsed="0"/>
-    <w:lsdException w:name="Colorful List Accent 2" w:semiHidden="0" w:uiPriority="72" w:unhideWhenUsed="0"/>
-    <w:lsdException w:name="Colorful Grid Accent 2" w:semiHidden="0" w:uiPriority="73" w:unhideWhenUsed="0"/>
-    <w:lsdException w:name="Light Shading Accent 3" w:semiHidden="0" w:uiPriority="60" w:unhideWhenUsed="0"/>
-    <w:lsdException w:name="Light List Accent 3" w:semiHidden="0" w:uiPriority="61" w:unhideWhenUsed="0"/>
-    <w:lsdException w:name="Light Grid Accent 3" w:semiHidden="0" w:uiPriority="62" w:unhideWhenUsed="0"/>
-    <w:lsdException w:name="Medium Shading 1 Accent 3" w:semiHidden="0" w:uiPriority="63" w:unhideWhenUsed="0"/>
-    <w:lsdException w:name="Medium Shading 2 Accent 3" w:semiHidden="0" w:uiPriority="64" w:unhideWhenUsed="0"/>
-    <w:lsdException w:name="Medium List 1 Accent 3" w:semiHidden="0" w:uiPriority="65" w:unhideWhenUsed="0"/>
-    <w:lsdException w:name="Medium List 2 Accent 3" w:semiHidden="0" w:uiPriority="66" w:unhideWhenUsed="0"/>
-    <w:lsdException w:name="Medium Grid 1 Accent 3" w:semiHidden="0" w:uiPriority="67" w:unhideWhenUsed="0"/>
-    <w:lsdException w:name="Medium Grid 2 Accent 3" w:semiHidden="0" w:uiPriority="68" w:unhideWhenUsed="0"/>
-    <w:lsdException w:name="Medium Grid 3 Accent 3" w:semiHidden="0" w:uiPriority="69" w:unhideWhenUsed="0"/>
-    <w:lsdException w:name="Dark List Accent 3" w:semiHidden="0" w:uiPriority="70" w:unhideWhenUsed="0"/>
-    <w:lsdException w:name="Colorful Shading Accent 3" w:semiHidden="0" w:uiPriority="71" w:unhideWhenUsed="0"/>
-    <w:lsdException w:name="Colorful List Accent 3" w:semiHidden="0" w:uiPriority="72" w:unhideWhenUsed="0"/>
-    <w:lsdException w:name="Colorful Grid Accent 3" w:semiHidden="0" w:uiPriority="73" w:unhideWhenUsed="0"/>
-    <w:lsdException w:name="Light Shading Accent 4" w:semiHidden="0" w:uiPriority="60" w:unhideWhenUsed="0"/>
-    <w:lsdException w:name="Light List Accent 4" w:semiHidden="0" w:uiPriority="61" w:unhideWhenUsed="0"/>
-    <w:lsdException w:name="Light Grid Accent 4" w:semiHidden="0" w:uiPriority="62" w:unhideWhenUsed="0"/>
-    <w:lsdException w:name="Medium Shading 1 Accent 4" w:semiHidden="0" w:uiPriority="63" w:unhideWhenUsed="0"/>
-    <w:lsdException w:name="Medium Shading 2 Accent 4" w:semiHidden="0" w:uiPriority="64" w:unhideWhenUsed="0"/>
-    <w:lsdException w:name="Medium List 1 Accent 4" w:semiHidden="0" w:uiPriority="65" w:unhideWhenUsed="0"/>
-    <w:lsdException w:name="Medium List 2 Accent 4" w:semiHidden="0" w:uiPriority="66" w:unhideWhenUsed="0"/>
-    <w:lsdException w:name="Medium Grid 1 Accent 4" w:semiHidden="0" w:uiPriority="67" w:unhideWhenUsed="0"/>
-    <w:lsdException w:name="Medium Grid 2 Accent 4" w:semiHidden="0" w:uiPriority="68" w:unhideWhenUsed="0"/>
-    <w:lsdException w:name="Medium Grid 3 Accent 4" w:semiHidden="0" w:uiPriority="69" w:unhideWhenUsed="0"/>
-    <w:lsdException w:name="Dark List Accent 4" w:semiHidden="0" w:uiPriority="70" w:unhideWhenUsed="0"/>
-    <w:lsdException w:name="Colorful Shading Accent 4" w:semiHidden="0" w:uiPriority="71" w:unhideWhenUsed="0"/>
-    <w:lsdException w:name="Colorful List Accent 4" w:semiHidden="0" w:uiPriority="72" w:unhideWhenUsed="0"/>
-    <w:lsdException w:name="Colorful Grid Accent 4" w:semiHidden="0" w:uiPriority="73" w:unhideWhenUsed="0"/>
-    <w:lsdException w:name="Light Shading Accent 5" w:semiHidden="0" w:uiPriority="60" w:unhideWhenUsed="0"/>
-    <w:lsdException w:name="Light List Accent 5" w:semiHidden="0" w:uiPriority="61" w:unhideWhenUsed="0"/>
-    <w:lsdException w:name="Light Grid Accent 5" w:semiHidden="0" w:uiPriority="62" w:unhideWhenUsed="0"/>
-    <w:lsdException w:name="Medium Shading 1 Accent 5" w:semiHidden="0" w:uiPriority="63" w:unhideWhenUsed="0"/>
-    <w:lsdException w:name="Medium Shading 2 Accent 5" w:semiHidden="0" w:uiPriority="64" w:unhideWhenUsed="0"/>
-    <w:lsdException w:name="Medium List 1 Accent 5" w:semiHidden="0" w:uiPriority="65" w:unhideWhenUsed="0"/>
-    <w:lsdException w:name="Medium List 2 Accent 5" w:semiHidden="0" w:uiPriority="66" w:unhideWhenUsed="0"/>
-    <w:lsdException w:name="Medium Grid 1 Accent 5" w:semiHidden="0" w:uiPriority="67" w:unhideWhenUsed="0"/>
-    <w:lsdException w:name="Medium Grid 2 Accent 5" w:semiHidden="0" w:uiPriority="68" w:unhideWhenUsed="0"/>
-    <w:lsdException w:name="Medium Grid 3 Accent 5" w:semiHidden="0" w:uiPriority="69" w:unhideWhenUsed="0"/>
-    <w:lsdException w:name="Dark List Accent 5" w:semiHidden="0" w:uiPriority="70" w:unhideWhenUsed="0"/>
-    <w:lsdException w:name="Colorful Shading Accent 5" w:semiHidden="0" w:uiPriority="71" w:unhideWhenUsed="0"/>
-    <w:lsdException w:name="Colorful List Accent 5" w:semiHidden="0" w:uiPriority="72" w:unhideWhenUsed="0"/>
-    <w:lsdException w:name="Colorful Grid Accent 5" w:semiHidden="0" w:uiPriority="73" w:unhideWhenUsed="0"/>
-    <w:lsdException w:name="Light Shading Accent 6" w:semiHidden="0" w:uiPriority="60" w:unhideWhenUsed="0"/>
-    <w:lsdException w:name="Light List Accent 6" w:semiHidden="0" w:uiPriority="61" w:unhideWhenUsed="0"/>
-    <w:lsdException w:name="Light Grid Accent 6" w:semiHidden="0" w:uiPriority="62" w:unhideWhenUsed="0"/>
-    <w:lsdException w:name="Medium Shading 1 Accent 6" w:semiHidden="0" w:uiPriority="63" w:unhideWhenUsed="0"/>
-    <w:lsdException w:name="Medium Shading 2 Accent 6" w:semiHidden="0" w:uiPriority="64" w:unhideWhenUsed="0"/>
-    <w:lsdException w:name="Medium List 1 Accent 6" w:semiHidden="0" w:uiPriority="65" w:unhideWhenUsed="0"/>
-    <w:lsdException w:name="Medium List 2 Accent 6" w:semiHidden="0" w:uiPriority="66" w:unhideWhenUsed="0"/>
-    <w:lsdException w:name="Medium Grid 1 Accent 6" w:semiHidden="0" w:uiPriority="67" w:unhideWhenUsed="0"/>
-    <w:lsdException w:name="Medium Grid 2 Accent 6" w:semiHidden="0" w:uiPriority="68" w:unhideWhenUsed="0"/>
-    <w:lsdException w:name="Medium Grid 3 Accent 6" w:semiHidden="0" w:uiPriority="69" w:unhideWhenUsed="0"/>
-    <w:lsdException w:name="Dark List Accent 6" w:semiHidden="0" w:uiPriority="70" w:unhideWhenUsed="0"/>
-    <w:lsdException w:name="Colorful Shading Accent 6" w:semiHidden="0" w:uiPriority="71" w:unhideWhenUsed="0"/>
-    <w:lsdException w:name="Colorful List Accent 6" w:semiHidden="0" w:uiPriority="72" w:unhideWhenUsed="0"/>
-    <w:lsdException w:name="Colorful Grid Accent 6" w:semiHidden="0" w:uiPriority="73" w:unhideWhenUsed="0"/>
-    <w:lsdException w:name="Subtle Emphasis" w:semiHidden="0" w:uiPriority="19" w:unhideWhenUsed="0" w:qFormat="1"/>
-    <w:lsdException w:name="Intense Emphasis" w:semiHidden="0" w:uiPriority="21" w:unhideWhenUsed="0" w:qFormat="1"/>
-    <w:lsdException w:name="Subtle Reference" w:semiHidden="0" w:uiPriority="31" w:unhideWhenUsed="0" w:qFormat="1"/>
-    <w:lsdException w:name="Intense Reference" w:semiHidden="0" w:uiPriority="32" w:unhideWhenUsed="0" w:qFormat="1"/>
-    <w:lsdException w:name="Book Title" w:semiHidden="0" w:uiPriority="33" w:unhideWhenUsed="0" w:qFormat="1"/>
-    <w:lsdException w:name="Bibliography" w:uiPriority="37"/>
-    <w:lsdException w:name="TOC Heading" w:uiPriority="39" w:qFormat="1"/>
+  <w:latentStyles w:defLockedState="0" w:defUIPriority="99" w:defSemiHidden="0" w:defUnhideWhenUsed="0" w:defQFormat="0" w:count="376">
+    <w:lsdException w:name="Normal" w:uiPriority="0" w:qFormat="1"/>
+    <w:lsdException w:name="heading 1" w:uiPriority="9" w:qFormat="1"/>
+    <w:lsdException w:name="heading 2" w:semiHidden="1" w:uiPriority="9" w:unhideWhenUsed="1" w:qFormat="1"/>
+    <w:lsdException w:name="heading 3" w:semiHidden="1" w:uiPriority="9" w:unhideWhenUsed="1" w:qFormat="1"/>
+    <w:lsdException w:name="heading 4" w:semiHidden="1" w:uiPriority="9" w:unhideWhenUsed="1" w:qFormat="1"/>
+    <w:lsdException w:name="heading 5" w:semiHidden="1" w:uiPriority="9" w:unhideWhenUsed="1" w:qFormat="1"/>
+    <w:lsdException w:name="heading 6" w:semiHidden="1" w:uiPriority="9" w:unhideWhenUsed="1" w:qFormat="1"/>
+    <w:lsdException w:name="heading 7" w:semiHidden="1" w:uiPriority="9" w:unhideWhenUsed="1" w:qFormat="1"/>
+    <w:lsdException w:name="heading 8" w:semiHidden="1" w:uiPriority="9" w:unhideWhenUsed="1" w:qFormat="1"/>
+    <w:lsdException w:name="heading 9" w:semiHidden="1" w:uiPriority="9" w:unhideWhenUsed="1" w:qFormat="1"/>
+    <w:lsdException w:name="index 1" w:semiHidden="1" w:unhideWhenUsed="1"/>
+    <w:lsdException w:name="index 2" w:semiHidden="1" w:unhideWhenUsed="1"/>
+    <w:lsdException w:name="index 3" w:semiHidden="1" w:unhideWhenUsed="1"/>
+    <w:lsdException w:name="index 4" w:semiHidden="1" w:unhideWhenUsed="1"/>
+    <w:lsdException w:name="index 5" w:semiHidden="1" w:unhideWhenUsed="1"/>
+    <w:lsdException w:name="index 6" w:semiHidden="1" w:unhideWhenUsed="1"/>
+    <w:lsdException w:name="index 7" w:semiHidden="1" w:unhideWhenUsed="1"/>
+    <w:lsdException w:name="index 8" w:semiHidden="1" w:unhideWhenUsed="1"/>
+    <w:lsdException w:name="index 9" w:semiHidden="1" w:unhideWhenUsed="1"/>
+    <w:lsdException w:name="toc 1" w:semiHidden="1" w:uiPriority="39" w:unhideWhenUsed="1"/>
+    <w:lsdException w:name="toc 2" w:semiHidden="1" w:uiPriority="39" w:unhideWhenUsed="1"/>
+    <w:lsdException w:name="toc 3" w:semiHidden="1" w:uiPriority="39" w:unhideWhenUsed="1"/>
+    <w:lsdException w:name="toc 4" w:semiHidden="1" w:uiPriority="39" w:unhideWhenUsed="1"/>
+    <w:lsdException w:name="toc 5" w:semiHidden="1" w:uiPriority="39" w:unhideWhenUsed="1"/>
+    <w:lsdException w:name="toc 6" w:semiHidden="1" w:uiPriority="39" w:unhideWhenUsed="1"/>
+    <w:lsdException w:name="toc 7" w:semiHidden="1" w:uiPriority="39" w:unhideWhenUsed="1"/>
+    <w:lsdException w:name="toc 8" w:semiHidden="1" w:uiPriority="39" w:unhideWhenUsed="1"/>
+    <w:lsdException w:name="toc 9" w:semiHidden="1" w:uiPriority="39" w:unhideWhenUsed="1"/>
+    <w:lsdException w:name="Normal Indent" w:semiHidden="1" w:unhideWhenUsed="1"/>
+    <w:lsdException w:name="footnote text" w:semiHidden="1" w:unhideWhenUsed="1"/>
+    <w:lsdException w:name="annotation text" w:semiHidden="1" w:unhideWhenUsed="1"/>
+    <w:lsdException w:name="header" w:semiHidden="1" w:unhideWhenUsed="1"/>
+    <w:lsdException w:name="footer" w:semiHidden="1" w:unhideWhenUsed="1"/>
+    <w:lsdException w:name="index heading" w:semiHidden="1" w:unhideWhenUsed="1"/>
+    <w:lsdException w:name="caption" w:semiHidden="1" w:uiPriority="35" w:unhideWhenUsed="1" w:qFormat="1"/>
+    <w:lsdException w:name="table of figures" w:semiHidden="1" w:unhideWhenUsed="1"/>
+    <w:lsdException w:name="envelope address" w:semiHidden="1" w:unhideWhenUsed="1"/>
+    <w:lsdException w:name="envelope return" w:semiHidden="1" w:unhideWhenUsed="1"/>
+    <w:lsdException w:name="footnote reference" w:semiHidden="1" w:unhideWhenUsed="1"/>
+    <w:lsdException w:name="annotation reference" w:semiHidden="1" w:unhideWhenUsed="1"/>
+    <w:lsdException w:name="line number" w:semiHidden="1" w:unhideWhenUsed="1"/>
+    <w:lsdException w:name="page number" w:semiHidden="1" w:unhideWhenUsed="1"/>
+    <w:lsdException w:name="endnote reference" w:semiHidden="1" w:unhideWhenUsed="1"/>
+    <w:lsdException w:name="endnote text" w:semiHidden="1" w:unhideWhenUsed="1"/>
+    <w:lsdException w:name="table of authorities" w:semiHidden="1" w:unhideWhenUsed="1"/>
+    <w:lsdException w:name="macro" w:semiHidden="1" w:unhideWhenUsed="1"/>
+    <w:lsdException w:name="toa heading" w:semiHidden="1" w:unhideWhenUsed="1"/>
+    <w:lsdException w:name="List" w:semiHidden="1" w:unhideWhenUsed="1"/>
+    <w:lsdException w:name="List Bullet" w:semiHidden="1" w:unhideWhenUsed="1"/>
+    <w:lsdException w:name="List Number" w:semiHidden="1" w:unhideWhenUsed="1"/>
+    <w:lsdException w:name="List 2" w:semiHidden="1" w:unhideWhenUsed="1"/>
+    <w:lsdException w:name="List 3" w:semiHidden="1" w:unhideWhenUsed="1"/>
+    <w:lsdException w:name="List 4" w:semiHidden="1" w:unhideWhenUsed="1"/>
+    <w:lsdException w:name="List 5" w:semiHidden="1" w:unhideWhenUsed="1"/>
+    <w:lsdException w:name="List Bullet 2" w:semiHidden="1" w:unhideWhenUsed="1"/>
+    <w:lsdException w:name="List Bullet 3" w:semiHidden="1" w:unhideWhenUsed="1"/>
+    <w:lsdException w:name="List Bullet 4" w:semiHidden="1" w:unhideWhenUsed="1"/>
+    <w:lsdException w:name="List Bullet 5" w:semiHidden="1" w:unhideWhenUsed="1"/>
+    <w:lsdException w:name="List Number 2" w:semiHidden="1" w:unhideWhenUsed="1"/>
+    <w:lsdException w:name="List Number 3" w:semiHidden="1" w:unhideWhenUsed="1"/>
+    <w:lsdException w:name="List Number 4" w:semiHidden="1" w:unhideWhenUsed="1"/>
+    <w:lsdException w:name="List Number 5" w:semiHidden="1" w:unhideWhenUsed="1"/>
+    <w:lsdException w:name="Title" w:uiPriority="10" w:qFormat="1"/>
+    <w:lsdException w:name="Closing" w:semiHidden="1" w:unhideWhenUsed="1"/>
+    <w:lsdException w:name="Signature" w:semiHidden="1" w:unhideWhenUsed="1"/>
+    <w:lsdException w:name="Default Paragraph Font" w:semiHidden="1" w:uiPriority="1" w:unhideWhenUsed="1"/>
+    <w:lsdException w:name="Body Text" w:semiHidden="1" w:unhideWhenUsed="1"/>
+    <w:lsdException w:name="Body Text Indent" w:semiHidden="1" w:unhideWhenUsed="1"/>
+    <w:lsdException w:name="List Continue" w:semiHidden="1" w:unhideWhenUsed="1"/>
+    <w:lsdException w:name="List Continue 2" w:semiHidden="1" w:unhideWhenUsed="1"/>
+    <w:lsdException w:name="List Continue 3" w:semiHidden="1" w:unhideWhenUsed="1"/>
+    <w:lsdException w:name="List Continue 4" w:semiHidden="1" w:unhideWhenUsed="1"/>
+    <w:lsdException w:name="List Continue 5" w:semiHidden="1" w:unhideWhenUsed="1"/>
+    <w:lsdException w:name="Message Header" w:semiHidden="1" w:unhideWhenUsed="1"/>
+    <w:lsdException w:name="Subtitle" w:uiPriority="11" w:qFormat="1"/>
+    <w:lsdException w:name="Salutation" w:semiHidden="1" w:unhideWhenUsed="1"/>
+    <w:lsdException w:name="Date" w:semiHidden="1" w:unhideWhenUsed="1"/>
+    <w:lsdException w:name="Body Text First Indent" w:semiHidden="1" w:unhideWhenUsed="1"/>
+    <w:lsdException w:name="Body Text First Indent 2" w:semiHidden="1" w:unhideWhenUsed="1"/>
+    <w:lsdException w:name="Note Heading" w:semiHidden="1" w:unhideWhenUsed="1"/>
+    <w:lsdException w:name="Body Text 2" w:semiHidden="1" w:unhideWhenUsed="1"/>
+    <w:lsdException w:name="Body Text 3" w:semiHidden="1" w:unhideWhenUsed="1"/>
+    <w:lsdException w:name="Body Text Indent 2" w:semiHidden="1" w:unhideWhenUsed="1"/>
+    <w:lsdException w:name="Body Text Indent 3" w:semiHidden="1" w:unhideWhenUsed="1"/>
+    <w:lsdException w:name="Block Text" w:semiHidden="1" w:unhideWhenUsed="1"/>
+    <w:lsdException w:name="Hyperlink" w:semiHidden="1" w:unhideWhenUsed="1"/>
+    <w:lsdException w:name="FollowedHyperlink" w:semiHidden="1" w:unhideWhenUsed="1"/>
+    <w:lsdException w:name="Strong" w:uiPriority="22" w:qFormat="1"/>
+    <w:lsdException w:name="Emphasis" w:uiPriority="20" w:qFormat="1"/>
+    <w:lsdException w:name="Document Map" w:semiHidden="1" w:unhideWhenUsed="1"/>
+    <w:lsdException w:name="Plain Text" w:semiHidden="1" w:unhideWhenUsed="1"/>
+    <w:lsdException w:name="E-mail Signature" w:semiHidden="1" w:unhideWhenUsed="1"/>
+    <w:lsdException w:name="HTML Top of Form" w:semiHidden="1" w:unhideWhenUsed="1"/>
+    <w:lsdException w:name="HTML Bottom of Form" w:semiHidden="1" w:unhideWhenUsed="1"/>
+    <w:lsdException w:name="Normal (Web)" w:semiHidden="1" w:unhideWhenUsed="1"/>
+    <w:lsdException w:name="HTML Acronym" w:semiHidden="1" w:unhideWhenUsed="1"/>
+    <w:lsdException w:name="HTML Address" w:semiHidden="1" w:unhideWhenUsed="1"/>
+    <w:lsdException w:name="HTML Cite" w:semiHidden="1" w:unhideWhenUsed="1"/>
+    <w:lsdException w:name="HTML Code" w:semiHidden="1" w:unhideWhenUsed="1"/>
+    <w:lsdException w:name="HTML Definition" w:semiHidden="1" w:unhideWhenUsed="1"/>
+    <w:lsdException w:name="HTML Keyboard" w:semiHidden="1" w:unhideWhenUsed="1"/>
+    <w:lsdException w:name="HTML Preformatted" w:semiHidden="1" w:unhideWhenUsed="1"/>
+    <w:lsdException w:name="HTML Sample" w:semiHidden="1" w:unhideWhenUsed="1"/>
+    <w:lsdException w:name="HTML Typewriter" w:semiHidden="1" w:unhideWhenUsed="1"/>
+    <w:lsdException w:name="HTML Variable" w:semiHidden="1" w:unhideWhenUsed="1"/>
+    <w:lsdException w:name="Normal Table" w:semiHidden="1" w:unhideWhenUsed="1"/>
+    <w:lsdException w:name="annotation subject" w:semiHidden="1" w:unhideWhenUsed="1"/>
+    <w:lsdException w:name="No List" w:semiHidden="1" w:unhideWhenUsed="1"/>
+    <w:lsdException w:name="Outline List 1" w:semiHidden="1" w:unhideWhenUsed="1"/>
+    <w:lsdException w:name="Outline List 2" w:semiHidden="1" w:unhideWhenUsed="1"/>
+    <w:lsdException w:name="Outline List 3" w:semiHidden="1" w:unhideWhenUsed="1"/>
+    <w:lsdException w:name="Table Simple 1" w:semiHidden="1" w:unhideWhenUsed="1"/>
+    <w:lsdException w:name="Table Simple 2" w:semiHidden="1" w:unhideWhenUsed="1"/>
+    <w:lsdException w:name="Table Simple 3" w:semiHidden="1" w:unhideWhenUsed="1"/>
+    <w:lsdException w:name="Table Classic 1" w:semiHidden="1" w:unhideWhenUsed="1"/>
+    <w:lsdException w:name="Table Classic 2" w:semiHidden="1" w:unhideWhenUsed="1"/>
+    <w:lsdException w:name="Table Classic 3" w:semiHidden="1" w:unhideWhenUsed="1"/>
+    <w:lsdException w:name="Table Classic 4" w:semiHidden="1" w:unhideWhenUsed="1"/>
+    <w:lsdException w:name="Table Colorful 1" w:semiHidden="1" w:unhideWhenUsed="1"/>
+    <w:lsdException w:name="Table Colorful 2" w:semiHidden="1" w:unhideWhenUsed="1"/>
+    <w:lsdException w:name="Table Colorful 3" w:semiHidden="1" w:unhideWhenUsed="1"/>
+    <w:lsdException w:name="Table Columns 1" w:semiHidden="1" w:unhideWhenUsed="1"/>
+    <w:lsdException w:name="Table Columns 2" w:semiHidden="1" w:unhideWhenUsed="1"/>
+    <w:lsdException w:name="Table Columns 3" w:semiHidden="1" w:unhideWhenUsed="1"/>
+    <w:lsdException w:name="Table Columns 4" w:semiHidden="1" w:unhideWhenUsed="1"/>
+    <w:lsdException w:name="Table Columns 5" w:semiHidden="1" w:unhideWhenUsed="1"/>
+    <w:lsdException w:name="Table Grid 1" w:semiHidden="1" w:unhideWhenUsed="1"/>
+    <w:lsdException w:name="Table Grid 2" w:semiHidden="1" w:unhideWhenUsed="1"/>
+    <w:lsdException w:name="Table Grid 3" w:semiHidden="1" w:unhideWhenUsed="1"/>
+    <w:lsdException w:name="Table Grid 4" w:semiHidden="1" w:unhideWhenUsed="1"/>
+    <w:lsdException w:name="Table Grid 5" w:semiHidden="1" w:unhideWhenUsed="1"/>
+    <w:lsdException w:name="Table Grid 6" w:semiHidden="1" w:unhideWhenUsed="1"/>
+    <w:lsdException w:name="Table Grid 7" w:semiHidden="1" w:unhideWhenUsed="1"/>
+    <w:lsdException w:name="Table Grid 8" w:semiHidden="1" w:unhideWhenUsed="1"/>
+    <w:lsdException w:name="Table List 1" w:semiHidden="1" w:unhideWhenUsed="1"/>
+    <w:lsdException w:name="Table List 2" w:semiHidden="1" w:unhideWhenUsed="1"/>
+    <w:lsdException w:name="Table List 3" w:semiHidden="1" w:unhideWhenUsed="1"/>
+    <w:lsdException w:name="Table List 4" w:semiHidden="1" w:unhideWhenUsed="1"/>
+    <w:lsdException w:name="Table List 5" w:semiHidden="1" w:unhideWhenUsed="1"/>
+    <w:lsdException w:name="Table List 6" w:semiHidden="1" w:unhideWhenUsed="1"/>
+    <w:lsdException w:name="Table List 7" w:semiHidden="1" w:unhideWhenUsed="1"/>
+    <w:lsdException w:name="Table List 8" w:semiHidden="1" w:unhideWhenUsed="1"/>
+    <w:lsdException w:name="Table 3D effects 1" w:semiHidden="1" w:unhideWhenUsed="1"/>
+    <w:lsdException w:name="Table 3D effects 2" w:semiHidden="1" w:unhideWhenUsed="1"/>
+    <w:lsdException w:name="Table 3D effects 3" w:semiHidden="1" w:unhideWhenUsed="1"/>
+    <w:lsdException w:name="Table Contemporary" w:semiHidden="1" w:unhideWhenUsed="1"/>
+    <w:lsdException w:name="Table Elegant" w:semiHidden="1" w:unhideWhenUsed="1"/>
+    <w:lsdException w:name="Table Professional" w:semiHidden="1" w:unhideWhenUsed="1"/>
+    <w:lsdException w:name="Table Subtle 1" w:semiHidden="1" w:unhideWhenUsed="1"/>
+    <w:lsdException w:name="Table Subtle 2" w:semiHidden="1" w:unhideWhenUsed="1"/>
+    <w:lsdException w:name="Table Web 1" w:semiHidden="1" w:unhideWhenUsed="1"/>
+    <w:lsdException w:name="Table Web 2" w:semiHidden="1" w:unhideWhenUsed="1"/>
+    <w:lsdException w:name="Table Web 3" w:semiHidden="1" w:unhideWhenUsed="1"/>
+    <w:lsdException w:name="Balloon Text" w:semiHidden="1" w:unhideWhenUsed="1"/>
+    <w:lsdException w:name="Table Grid" w:uiPriority="59"/>
+    <w:lsdException w:name="Table Theme" w:semiHidden="1" w:unhideWhenUsed="1"/>
+    <w:lsdException w:name="Placeholder Text" w:semiHidden="1"/>
+    <w:lsdException w:name="No Spacing" w:uiPriority="1" w:qFormat="1"/>
+    <w:lsdException w:name="Light Shading" w:uiPriority="60"/>
+    <w:lsdException w:name="Light List" w:uiPriority="61"/>
+    <w:lsdException w:name="Light Grid" w:uiPriority="62"/>
+    <w:lsdException w:name="Medium Shading 1" w:uiPriority="63"/>
+    <w:lsdException w:name="Medium Shading 2" w:uiPriority="64"/>
+    <w:lsdException w:name="Medium List 1" w:uiPriority="65"/>
+    <w:lsdException w:name="Medium List 2" w:uiPriority="66"/>
+    <w:lsdException w:name="Medium Grid 1" w:uiPriority="67"/>
+    <w:lsdException w:name="Medium Grid 2" w:uiPriority="68"/>
+    <w:lsdException w:name="Medium Grid 3" w:uiPriority="69"/>
+    <w:lsdException w:name="Dark List" w:uiPriority="70"/>
+    <w:lsdException w:name="Colorful Shading" w:uiPriority="71"/>
+    <w:lsdException w:name="Colorful List" w:uiPriority="72"/>
+    <w:lsdException w:name="Colorful Grid" w:uiPriority="73"/>
+    <w:lsdException w:name="Light Shading Accent 1" w:uiPriority="60"/>
+    <w:lsdException w:name="Light List Accent 1" w:uiPriority="61"/>
+    <w:lsdException w:name="Light Grid Accent 1" w:uiPriority="62"/>
+    <w:lsdException w:name="Medium Shading 1 Accent 1" w:uiPriority="63"/>
+    <w:lsdException w:name="Medium Shading 2 Accent 1" w:uiPriority="64"/>
+    <w:lsdException w:name="Medium List 1 Accent 1" w:uiPriority="65"/>
+    <w:lsdException w:name="Revision" w:semiHidden="1"/>
+    <w:lsdException w:name="List Paragraph" w:uiPriority="34" w:qFormat="1"/>
+    <w:lsdException w:name="Quote" w:uiPriority="29" w:qFormat="1"/>
+    <w:lsdException w:name="Intense Quote" w:uiPriority="30" w:qFormat="1"/>
+    <w:lsdException w:name="Medium List 2 Accent 1" w:uiPriority="66"/>
+    <w:lsdException w:name="Medium Grid 1 Accent 1" w:uiPriority="67"/>
+    <w:lsdException w:name="Medium Grid 2 Accent 1" w:uiPriority="68"/>
+    <w:lsdException w:name="Medium Grid 3 Accent 1" w:uiPriority="69"/>
+    <w:lsdException w:name="Dark List Accent 1" w:uiPriority="70"/>
+    <w:lsdException w:name="Colorful Shading Accent 1" w:uiPriority="71"/>
+    <w:lsdException w:name="Colorful List Accent 1" w:uiPriority="72"/>
+    <w:lsdException w:name="Colorful Grid Accent 1" w:uiPriority="73"/>
+    <w:lsdException w:name="Light Shading Accent 2" w:uiPriority="60"/>
+    <w:lsdException w:name="Light List Accent 2" w:uiPriority="61"/>
+    <w:lsdException w:name="Light Grid Accent 2" w:uiPriority="62"/>
+    <w:lsdException w:name="Medium Shading 1 Accent 2" w:uiPriority="63"/>
+    <w:lsdException w:name="Medium Shading 2 Accent 2" w:uiPriority="64"/>
+    <w:lsdException w:name="Medium List 1 Accent 2" w:uiPriority="65"/>
+    <w:lsdException w:name="Medium List 2 Accent 2" w:uiPriority="66"/>
+    <w:lsdException w:name="Medium Grid 1 Accent 2" w:uiPriority="67"/>
+    <w:lsdException w:name="Medium Grid 2 Accent 2" w:uiPriority="68"/>
+    <w:lsdException w:name="Medium Grid 3 Accent 2" w:uiPriority="69"/>
+    <w:lsdException w:name="Dark List Accent 2" w:uiPriority="70"/>
+    <w:lsdException w:name="Colorful Shading Accent 2" w:uiPriority="71"/>
+    <w:lsdException w:name="Colorful List Accent 2" w:uiPriority="72"/>
+    <w:lsdException w:name="Colorful Grid Accent 2" w:uiPriority="73"/>
+    <w:lsdException w:name="Light Shading Accent 3" w:uiPriority="60"/>
+    <w:lsdException w:name="Light List Accent 3" w:uiPriority="61"/>
+    <w:lsdException w:name="Light Grid Accent 3" w:uiPriority="62"/>
+    <w:lsdException w:name="Medium Shading 1 Accent 3" w:uiPriority="63"/>
+    <w:lsdException w:name="Medium Shading 2 Accent 3" w:uiPriority="64"/>
+    <w:lsdException w:name="Medium List 1 Accent 3" w:uiPriority="65"/>
+    <w:lsdException w:name="Medium List 2 Accent 3" w:uiPriority="66"/>
+    <w:lsdException w:name="Medium Grid 1 Accent 3" w:uiPriority="67"/>
+    <w:lsdException w:name="Medium Grid 2 Accent 3" w:uiPriority="68"/>
+    <w:lsdException w:name="Medium Grid 3 Accent 3" w:uiPriority="69"/>
+    <w:lsdException w:name="Dark List Accent 3" w:uiPriority="70"/>
+    <w:lsdException w:name="Colorful Shading Accent 3" w:uiPriority="71"/>
+    <w:lsdException w:name="Colorful List Accent 3" w:uiPriority="72"/>
+    <w:lsdException w:name="Colorful Grid Accent 3" w:uiPriority="73"/>
+    <w:lsdException w:name="Light Shading Accent 4" w:uiPriority="60"/>
+    <w:lsdException w:name="Light List Accent 4" w:uiPriority="61"/>
+    <w:lsdException w:name="Light Grid Accent 4" w:uiPriority="62"/>
+    <w:lsdException w:name="Medium Shading 1 Accent 4" w:uiPriority="63"/>
+    <w:lsdException w:name="Medium Shading 2 Accent 4" w:uiPriority="64"/>
+    <w:lsdException w:name="Medium List 1 Accent 4" w:uiPriority="65"/>
+    <w:lsdException w:name="Medium List 2 Accent 4" w:uiPriority="66"/>
+    <w:lsdException w:name="Medium Grid 1 Accent 4" w:uiPriority="67"/>
+    <w:lsdException w:name="Medium Grid 2 Accent 4" w:uiPriority="68"/>
+    <w:lsdException w:name="Medium Grid 3 Accent 4" w:uiPriority="69"/>
+    <w:lsdException w:name="Dark List Accent 4" w:uiPriority="70"/>
+    <w:lsdException w:name="Colorful Shading Accent 4" w:uiPriority="71"/>
+    <w:lsdException w:name="Colorful List Accent 4" w:uiPriority="72"/>
+    <w:lsdException w:name="Colorful Grid Accent 4" w:uiPriority="73"/>
+    <w:lsdException w:name="Light Shading Accent 5" w:uiPriority="60"/>
+    <w:lsdException w:name="Light List Accent 5" w:uiPriority="61"/>
+    <w:lsdException w:name="Light Grid Accent 5" w:uiPriority="62"/>
+    <w:lsdException w:name="Medium Shading 1 Accent 5" w:uiPriority="63"/>
+    <w:lsdException w:name="Medium Shading 2 Accent 5" w:uiPriority="64"/>
+    <w:lsdException w:name="Medium List 1 Accent 5" w:uiPriority="65"/>
+    <w:lsdException w:name="Medium List 2 Accent 5" w:uiPriority="66"/>
+    <w:lsdException w:name="Medium Grid 1 Accent 5" w:uiPriority="67"/>
+    <w:lsdException w:name="Medium Grid 2 Accent 5" w:uiPriority="68"/>
+    <w:lsdException w:name="Medium Grid 3 Accent 5" w:uiPriority="69"/>
+    <w:lsdException w:name="Dark List Accent 5" w:uiPriority="70"/>
+    <w:lsdException w:name="Colorful Shading Accent 5" w:uiPriority="71"/>
+    <w:lsdException w:name="Colorful List Accent 5" w:uiPriority="72"/>
+    <w:lsdException w:name="Colorful Grid Accent 5" w:uiPriority="73"/>
+    <w:lsdException w:name="Light Shading Accent 6" w:uiPriority="60"/>
+    <w:lsdException w:name="Light List Accent 6" w:uiPriority="61"/>
+    <w:lsdException w:name="Light Grid Accent 6" w:uiPriority="62"/>
+    <w:lsdException w:name="Medium Shading 1 Accent 6" w:uiPriority="63"/>
+    <w:lsdException w:name="Medium Shading 2 Accent 6" w:uiPriority="64"/>
+    <w:lsdException w:name="Medium List 1 Accent 6" w:uiPriority="65"/>
+    <w:lsdException w:name="Medium List 2 Accent 6" w:uiPriority="66"/>
+    <w:lsdException w:name="Medium Grid 1 Accent 6" w:uiPriority="67"/>
+    <w:lsdException w:name="Medium Grid 2 Accent 6" w:uiPriority="68"/>
+    <w:lsdException w:name="Medium Grid 3 Accent 6" w:uiPriority="69"/>
+    <w:lsdException w:name="Dark List Accent 6" w:uiPriority="70"/>
+    <w:lsdException w:name="Colorful Shading Accent 6" w:uiPriority="71"/>
+    <w:lsdException w:name="Colorful List Accent 6" w:uiPriority="72"/>
+    <w:lsdException w:name="Colorful Grid Accent 6" w:uiPriority="73"/>
+    <w:lsdException w:name="Subtle Emphasis" w:uiPriority="19" w:qFormat="1"/>
+    <w:lsdException w:name="Intense Emphasis" w:uiPriority="21" w:qFormat="1"/>
+    <w:lsdException w:name="Subtle Reference" w:uiPriority="31" w:qFormat="1"/>
+    <w:lsdException w:name="Intense Reference" w:uiPriority="32" w:qFormat="1"/>
+    <w:lsdException w:name="Book Title" w:uiPriority="33" w:qFormat="1"/>
+    <w:lsdException w:name="Bibliography" w:semiHidden="1" w:uiPriority="37" w:unhideWhenUsed="1"/>
+    <w:lsdException w:name="TOC Heading" w:semiHidden="1" w:uiPriority="39" w:unhideWhenUsed="1" w:qFormat="1"/>
+    <w:lsdException w:name="Plain Table 1" w:uiPriority="41"/>
+    <w:lsdException w:name="Plain Table 2" w:uiPriority="42"/>
+    <w:lsdException w:name="Plain Table 3" w:uiPriority="43"/>
+    <w:lsdException w:name="Plain Table 4" w:uiPriority="44"/>
+    <w:lsdException w:name="Plain Table 5" w:uiPriority="45"/>
+    <w:lsdException w:name="Grid Table Light" w:uiPriority="40"/>
+    <w:lsdException w:name="Grid Table 1 Light" w:uiPriority="46"/>
+    <w:lsdException w:name="Grid Table 2" w:uiPriority="47"/>
+    <w:lsdException w:name="Grid Table 3" w:uiPriority="48"/>
+    <w:lsdException w:name="Grid Table 4" w:uiPriority="49"/>
+    <w:lsdException w:name="Grid Table 5 Dark" w:uiPriority="50"/>
+    <w:lsdException w:name="Grid Table 6 Colorful" w:uiPriority="51"/>
+    <w:lsdException w:name="Grid Table 7 Colorful" w:uiPriority="52"/>
+    <w:lsdException w:name="Grid Table 1 Light Accent 1" w:uiPriority="46"/>
+    <w:lsdException w:name="Grid Table 2 Accent 1" w:uiPriority="47"/>
+    <w:lsdException w:name="Grid Table 3 Accent 1" w:uiPriority="48"/>
+    <w:lsdException w:name="Grid Table 4 Accent 1" w:uiPriority="49"/>
+    <w:lsdException w:name="Grid Table 5 Dark Accent 1" w:uiPriority="50"/>
+    <w:lsdException w:name="Grid Table 6 Colorful Accent 1" w:uiPriority="51"/>
+    <w:lsdException w:name="Grid Table 7 Colorful Accent 1" w:uiPriority="52"/>
+    <w:lsdException w:name="Grid Table 1 Light Accent 2" w:uiPriority="46"/>
+    <w:lsdException w:name="Grid Table 2 Accent 2" w:uiPriority="47"/>
+    <w:lsdException w:name="Grid Table 3 Accent 2" w:uiPriority="48"/>
+    <w:lsdException w:name="Grid Table 4 Accent 2" w:uiPriority="49"/>
+    <w:lsdException w:name="Grid Table 5 Dark Accent 2" w:uiPriority="50"/>
+    <w:lsdException w:name="Grid Table 6 Colorful Accent 2" w:uiPriority="51"/>
+    <w:lsdException w:name="Grid Table 7 Colorful Accent 2" w:uiPriority="52"/>
+    <w:lsdException w:name="Grid Table 1 Light Accent 3" w:uiPriority="46"/>
+    <w:lsdException w:name="Grid Table 2 Accent 3" w:uiPriority="47"/>
+    <w:lsdException w:name="Grid Table 3 Accent 3" w:uiPriority="48"/>
+    <w:lsdException w:name="Grid Table 4 Accent 3" w:uiPriority="49"/>
+    <w:lsdException w:name="Grid Table 5 Dark Accent 3" w:uiPriority="50"/>
+    <w:lsdException w:name="Grid Table 6 Colorful Accent 3" w:uiPriority="51"/>
+    <w:lsdException w:name="Grid Table 7 Colorful Accent 3" w:uiPriority="52"/>
+    <w:lsdException w:name="Grid Table 1 Light Accent 4" w:uiPriority="46"/>
+    <w:lsdException w:name="Grid Table 2 Accent 4" w:uiPriority="47"/>
+    <w:lsdException w:name="Grid Table 3 Accent 4" w:uiPriority="48"/>
+    <w:lsdException w:name="Grid Table 4 Accent 4" w:uiPriority="49"/>
+    <w:lsdException w:name="Grid Table 5 Dark Accent 4" w:uiPriority="50"/>
+    <w:lsdException w:name="Grid Table 6 Colorful Accent 4" w:uiPriority="51"/>
+    <w:lsdException w:name="Grid Table 7 Colorful Accent 4" w:uiPriority="52"/>
+    <w:lsdException w:name="Grid Table 1 Light Accent 5" w:uiPriority="46"/>
+    <w:lsdException w:name="Grid Table 2 Accent 5" w:uiPriority="47"/>
+    <w:lsdException w:name="Grid Table 3 Accent 5" w:uiPriority="48"/>
+    <w:lsdException w:name="Grid Table 4 Accent 5" w:uiPriority="49"/>
+    <w:lsdException w:name="Grid Table 5 Dark Accent 5" w:uiPriority="50"/>
+    <w:lsdException w:name="Grid Table 6 Colorful Accent 5" w:uiPriority="51"/>
+    <w:lsdException w:name="Grid Table 7 Colorful Accent 5" w:uiPriority="52"/>
+    <w:lsdException w:name="Grid Table 1 Light Accent 6" w:uiPriority="46"/>
+    <w:lsdException w:name="Grid Table 2 Accent 6" w:uiPriority="47"/>
+    <w:lsdException w:name="Grid Table 3 Accent 6" w:uiPriority="48"/>
+    <w:lsdException w:name="Grid Table 4 Accent 6" w:uiPriority="49"/>
+    <w:lsdException w:name="Grid Table 5 Dark Accent 6" w:uiPriority="50"/>
+    <w:lsdException w:name="Grid Table 6 Colorful Accent 6" w:uiPriority="51"/>
+    <w:lsdException w:name="Grid Table 7 Colorful Accent 6" w:uiPriority="52"/>
+    <w:lsdException w:name="List Table 1 Light" w:uiPriority="46"/>
+    <w:lsdException w:name="List Table 2" w:uiPriority="47"/>
+    <w:lsdException w:name="List Table 3" w:uiPriority="48"/>
+    <w:lsdException w:name="List Table 4" w:uiPriority="49"/>
+    <w:lsdException w:name="List Table 5 Dark" w:uiPriority="50"/>
+    <w:lsdException w:name="List Table 6 Colorful" w:uiPriority="51"/>
+    <w:lsdException w:name="List Table 7 Colorful" w:uiPriority="52"/>
+    <w:lsdException w:name="List Table 1 Light Accent 1" w:uiPriority="46"/>
+    <w:lsdException w:name="List Table 2 Accent 1" w:uiPriority="47"/>
+    <w:lsdException w:name="List Table 3 Accent 1" w:uiPriority="48"/>
+    <w:lsdException w:name="List Table 4 Accent 1" w:uiPriority="49"/>
+    <w:lsdException w:name="List Table 5 Dark Accent 1" w:uiPriority="50"/>
+    <w:lsdException w:name="List Table 6 Colorful Accent 1" w:uiPriority="51"/>
+    <w:lsdException w:name="List Table 7 Colorful Accent 1" w:uiPriority="52"/>
+    <w:lsdException w:name="List Table 1 Light Accent 2" w:uiPriority="46"/>
+    <w:lsdException w:name="List Table 2 Accent 2" w:uiPriority="47"/>
+    <w:lsdException w:name="List Table 3 Accent 2" w:uiPriority="48"/>
+    <w:lsdException w:name="List Table 4 Accent 2" w:uiPriority="49"/>
+    <w:lsdException w:name="List Table 5 Dark Accent 2" w:uiPriority="50"/>
+    <w:lsdException w:name="List Table 6 Colorful Accent 2" w:uiPriority="51"/>
+    <w:lsdException w:name="List Table 7 Colorful Accent 2" w:uiPriority="52"/>
+    <w:lsdException w:name="List Table 1 Light Accent 3" w:uiPriority="46"/>
+    <w:lsdException w:name="List Table 2 Accent 3" w:uiPriority="47"/>
+    <w:lsdException w:name="List Table 3 Accent 3" w:uiPriority="48"/>
+    <w:lsdException w:name="List Table 4 Accent 3" w:uiPriority="49"/>
+    <w:lsdException w:name="List Table 5 Dark Accent 3" w:uiPriority="50"/>
+    <w:lsdException w:name="List Table 6 Colorful Accent 3" w:uiPriority="51"/>
+    <w:lsdException w:name="List Table 7 Colorful Accent 3" w:uiPriority="52"/>
+    <w:lsdException w:name="List Table 1 Light Accent 4" w:uiPriority="46"/>
+    <w:lsdException w:name="List Table 2 Accent 4" w:uiPriority="47"/>
+    <w:lsdException w:name="List Table 3 Accent 4" w:uiPriority="48"/>
+    <w:lsdException w:name="List Table 4 Accent 4" w:uiPriority="49"/>
+    <w:lsdException w:name="List Table 5 Dark Accent 4" w:uiPriority="50"/>
+    <w:lsdException w:name="List Table 6 Colorful Accent 4" w:uiPriority="51"/>
+    <w:lsdException w:name="List Table 7 Colorful Accent 4" w:uiPriority="52"/>
+    <w:lsdException w:name="List Table 1 Light Accent 5" w:uiPriority="46"/>
+    <w:lsdException w:name="List Table 2 Accent 5" w:uiPriority="47"/>
+    <w:lsdException w:name="List Table 3 Accent 5" w:uiPriority="48"/>
+    <w:lsdException w:name="List Table 4 Accent 5" w:uiPriority="49"/>
+    <w:lsdException w:name="List Table 5 Dark Accent 5" w:uiPriority="50"/>
+    <w:lsdException w:name="List Table 6 Colorful Accent 5" w:uiPriority="51"/>
+    <w:lsdException w:name="List Table 7 Colorful Accent 5" w:uiPriority="52"/>
+    <w:lsdException w:name="List Table 1 Light Accent 6" w:uiPriority="46"/>
+    <w:lsdException w:name="List Table 2 Accent 6" w:uiPriority="47"/>
+    <w:lsdException w:name="List Table 3 Accent 6" w:uiPriority="48"/>
+    <w:lsdException w:name="List Table 4 Accent 6" w:uiPriority="49"/>
+    <w:lsdException w:name="List Table 5 Dark Accent 6" w:uiPriority="50"/>
+    <w:lsdException w:name="List Table 6 Colorful Accent 6" w:uiPriority="51"/>
+    <w:lsdException w:name="List Table 7 Colorful Accent 6" w:uiPriority="52"/>
+    <w:lsdException w:name="Mention" w:semiHidden="1" w:unhideWhenUsed="1"/>
+    <w:lsdException w:name="Smart Hyperlink" w:semiHidden="1" w:unhideWhenUsed="1"/>
+    <w:lsdException w:name="Hashtag" w:semiHidden="1" w:unhideWhenUsed="1"/>
+    <w:lsdException w:name="Unresolved Mention" w:semiHidden="1" w:unhideWhenUsed="1"/>
+    <w:lsdException w:name="Smart Link" w:semiHidden="1" w:unhideWhenUsed="1"/>
   </w:latentStyles>
   <w:style w:type="paragraph" w:default="1" w:styleId="Normal">
     <w:name w:val="Normal"/>
@@ -1049,7 +1282,6 @@
       <w:spacing w:after="0" w:line="240" w:lineRule="auto"/>
     </w:pPr>
     <w:tblPr>
-      <w:tblInd w:w="0" w:type="dxa"/>
       <w:tblBorders>
         <w:top w:val="single" w:sz="4" w:space="0" w:color="000000" w:themeColor="text1"/>
         <w:left w:val="single" w:sz="4" w:space="0" w:color="000000" w:themeColor="text1"/>
@@ -1058,272 +1290,6 @@
         <w:insideH w:val="single" w:sz="4" w:space="0" w:color="000000" w:themeColor="text1"/>
         <w:insideV w:val="single" w:sz="4" w:space="0" w:color="000000" w:themeColor="text1"/>
       </w:tblBorders>
-      <w:tblCellMar>
-        <w:top w:w="0" w:type="dxa"/>
-        <w:left w:w="108" w:type="dxa"/>
-        <w:bottom w:w="0" w:type="dxa"/>
-        <w:right w:w="108" w:type="dxa"/>
-      </w:tblCellMar>
-    </w:tblPr>
-  </w:style>
-  <w:style w:type="paragraph" w:styleId="Header">
-    <w:name w:val="header"/>
-    <w:basedOn w:val="Normal"/>
-    <w:link w:val="HeaderChar"/>
-    <w:uiPriority w:val="99"/>
-    <w:unhideWhenUsed/>
-    <w:rsid w:val="00530632"/>
-    <w:pPr>
-      <w:tabs>
-        <w:tab w:val="center" w:pos="4680"/>
-        <w:tab w:val="right" w:pos="9360"/>
-      </w:tabs>
-      <w:spacing w:after="0" w:line="240" w:lineRule="auto"/>
-    </w:pPr>
-  </w:style>
-  <w:style w:type="character" w:customStyle="1" w:styleId="HeaderChar">
-    <w:name w:val="Header Char"/>
-    <w:basedOn w:val="DefaultParagraphFont"/>
-    <w:link w:val="Header"/>
-    <w:uiPriority w:val="99"/>
-    <w:rsid w:val="00530632"/>
-  </w:style>
-  <w:style w:type="paragraph" w:styleId="Footer">
-    <w:name w:val="footer"/>
-    <w:basedOn w:val="Normal"/>
-    <w:link w:val="FooterChar"/>
-    <w:uiPriority w:val="99"/>
-    <w:unhideWhenUsed/>
-    <w:rsid w:val="00530632"/>
-    <w:pPr>
-      <w:tabs>
-        <w:tab w:val="center" w:pos="4680"/>
-        <w:tab w:val="right" w:pos="9360"/>
-      </w:tabs>
-      <w:spacing w:after="0" w:line="240" w:lineRule="auto"/>
-    </w:pPr>
-  </w:style>
-  <w:style w:type="character" w:customStyle="1" w:styleId="FooterChar">
-    <w:name w:val="Footer Char"/>
-    <w:basedOn w:val="DefaultParagraphFont"/>
-    <w:link w:val="Footer"/>
-    <w:uiPriority w:val="99"/>
-    <w:rsid w:val="00530632"/>
-  </w:style>
-</w:styles>
-</file>
-
-<file path=word/stylesWithEffects.xml><?xml version="1.0" encoding="utf-8"?>
-<w:styles xmlns:wpc="http://schemas.microsoft.com/office/word/2010/wordprocessingCanvas" xmlns:mc="http://schemas.openxmlformats.org/markup-compatibility/2006" xmlns:o="urn:schemas-microsoft-com:office:office" xmlns:r="http://schemas.openxmlformats.org/officeDocument/2006/relationships" xmlns:m="http://schemas.openxmlformats.org/officeDocument/2006/math" xmlns:v="urn:schemas-microsoft-com:vml" xmlns:wp14="http://schemas.microsoft.com/office/word/2010/wordprocessingDrawing" xmlns:wp="http://schemas.openxmlformats.org/drawingml/2006/wordprocessingDrawing" xmlns:w10="urn:schemas-microsoft-com:office:word" xmlns:w="http://schemas.openxmlformats.org/wordprocessingml/2006/main" xmlns:w14="http://schemas.microsoft.com/office/word/2010/wordml" xmlns:wpg="http://schemas.microsoft.com/office/word/2010/wordprocessingGroup" xmlns:wpi="http://schemas.microsoft.com/office/word/2010/wordprocessingInk" xmlns:wne="http://schemas.microsoft.com/office/word/2006/wordml" xmlns:wps="http://schemas.microsoft.com/office/word/2010/wordprocessingShape" mc:Ignorable="w14 wp14">
-  <w:docDefaults>
-    <w:rPrDefault>
-      <w:rPr>
-        <w:rFonts w:asciiTheme="minorHAnsi" w:eastAsiaTheme="minorEastAsia" w:hAnsiTheme="minorHAnsi" w:cstheme="minorBidi"/>
-        <w:sz w:val="22"/>
-        <w:szCs w:val="22"/>
-        <w:lang w:val="en-US" w:eastAsia="en-US" w:bidi="ar-SA"/>
-      </w:rPr>
-    </w:rPrDefault>
-    <w:pPrDefault>
-      <w:pPr>
-        <w:spacing w:after="200" w:line="276" w:lineRule="auto"/>
-      </w:pPr>
-    </w:pPrDefault>
-  </w:docDefaults>
-  <w:latentStyles w:defLockedState="0" w:defUIPriority="99" w:defSemiHidden="1" w:defUnhideWhenUsed="1" w:defQFormat="0" w:count="267">
-    <w:lsdException w:name="Normal" w:semiHidden="0" w:uiPriority="0" w:unhideWhenUsed="0" w:qFormat="1"/>
-    <w:lsdException w:name="heading 1" w:semiHidden="0" w:uiPriority="9" w:unhideWhenUsed="0" w:qFormat="1"/>
-    <w:lsdException w:name="heading 2" w:uiPriority="9" w:qFormat="1"/>
-    <w:lsdException w:name="heading 3" w:uiPriority="9" w:qFormat="1"/>
-    <w:lsdException w:name="heading 4" w:uiPriority="9" w:qFormat="1"/>
-    <w:lsdException w:name="heading 5" w:uiPriority="9" w:qFormat="1"/>
-    <w:lsdException w:name="heading 6" w:uiPriority="9" w:qFormat="1"/>
-    <w:lsdException w:name="heading 7" w:uiPriority="9" w:qFormat="1"/>
-    <w:lsdException w:name="heading 8" w:uiPriority="9" w:qFormat="1"/>
-    <w:lsdException w:name="heading 9" w:uiPriority="9" w:qFormat="1"/>
-    <w:lsdException w:name="toc 1" w:uiPriority="39"/>
-    <w:lsdException w:name="toc 2" w:uiPriority="39"/>
-    <w:lsdException w:name="toc 3" w:uiPriority="39"/>
-    <w:lsdException w:name="toc 4" w:uiPriority="39"/>
-    <w:lsdException w:name="toc 5" w:uiPriority="39"/>
-    <w:lsdException w:name="toc 6" w:uiPriority="39"/>
-    <w:lsdException w:name="toc 7" w:uiPriority="39"/>
-    <w:lsdException w:name="toc 8" w:uiPriority="39"/>
-    <w:lsdException w:name="toc 9" w:uiPriority="39"/>
-    <w:lsdException w:name="caption" w:uiPriority="35" w:qFormat="1"/>
-    <w:lsdException w:name="Title" w:semiHidden="0" w:uiPriority="10" w:unhideWhenUsed="0" w:qFormat="1"/>
-    <w:lsdException w:name="Default Paragraph Font" w:uiPriority="1"/>
-    <w:lsdException w:name="Subtitle" w:semiHidden="0" w:uiPriority="11" w:unhideWhenUsed="0" w:qFormat="1"/>
-    <w:lsdException w:name="Strong" w:semiHidden="0" w:uiPriority="22" w:unhideWhenUsed="0" w:qFormat="1"/>
-    <w:lsdException w:name="Emphasis" w:semiHidden="0" w:uiPriority="20" w:unhideWhenUsed="0" w:qFormat="1"/>
-    <w:lsdException w:name="Table Grid" w:semiHidden="0" w:uiPriority="59" w:unhideWhenUsed="0"/>
-    <w:lsdException w:name="Placeholder Text" w:unhideWhenUsed="0"/>
-    <w:lsdException w:name="No Spacing" w:semiHidden="0" w:uiPriority="1" w:unhideWhenUsed="0" w:qFormat="1"/>
-    <w:lsdException w:name="Light Shading" w:semiHidden="0" w:uiPriority="60" w:unhideWhenUsed="0"/>
-    <w:lsdException w:name="Light List" w:semiHidden="0" w:uiPriority="61" w:unhideWhenUsed="0"/>
-    <w:lsdException w:name="Light Grid" w:semiHidden="0" w:uiPriority="62" w:unhideWhenUsed="0"/>
-    <w:lsdException w:name="Medium Shading 1" w:semiHidden="0" w:uiPriority="63" w:unhideWhenUsed="0"/>
-    <w:lsdException w:name="Medium Shading 2" w:semiHidden="0" w:uiPriority="64" w:unhideWhenUsed="0"/>
-    <w:lsdException w:name="Medium List 1" w:semiHidden="0" w:uiPriority="65" w:unhideWhenUsed="0"/>
-    <w:lsdException w:name="Medium List 2" w:semiHidden="0" w:uiPriority="66" w:unhideWhenUsed="0"/>
-    <w:lsdException w:name="Medium Grid 1" w:semiHidden="0" w:uiPriority="67" w:unhideWhenUsed="0"/>
-    <w:lsdException w:name="Medium Grid 2" w:semiHidden="0" w:uiPriority="68" w:unhideWhenUsed="0"/>
-    <w:lsdException w:name="Medium Grid 3" w:semiHidden="0" w:uiPriority="69" w:unhideWhenUsed="0"/>
-    <w:lsdException w:name="Dark List" w:semiHidden="0" w:uiPriority="70" w:unhideWhenUsed="0"/>
-    <w:lsdException w:name="Colorful Shading" w:semiHidden="0" w:uiPriority="71" w:unhideWhenUsed="0"/>
-    <w:lsdException w:name="Colorful List" w:semiHidden="0" w:uiPriority="72" w:unhideWhenUsed="0"/>
-    <w:lsdException w:name="Colorful Grid" w:semiHidden="0" w:uiPriority="73" w:unhideWhenUsed="0"/>
-    <w:lsdException w:name="Light Shading Accent 1" w:semiHidden="0" w:uiPriority="60" w:unhideWhenUsed="0"/>
-    <w:lsdException w:name="Light List Accent 1" w:semiHidden="0" w:uiPriority="61" w:unhideWhenUsed="0"/>
-    <w:lsdException w:name="Light Grid Accent 1" w:semiHidden="0" w:uiPriority="62" w:unhideWhenUsed="0"/>
-    <w:lsdException w:name="Medium Shading 1 Accent 1" w:semiHidden="0" w:uiPriority="63" w:unhideWhenUsed="0"/>
-    <w:lsdException w:name="Medium Shading 2 Accent 1" w:semiHidden="0" w:uiPriority="64" w:unhideWhenUsed="0"/>
-    <w:lsdException w:name="Medium List 1 Accent 1" w:semiHidden="0" w:uiPriority="65" w:unhideWhenUsed="0"/>
-    <w:lsdException w:name="Revision" w:unhideWhenUsed="0"/>
-    <w:lsdException w:name="List Paragraph" w:semiHidden="0" w:uiPriority="34" w:unhideWhenUsed="0" w:qFormat="1"/>
-    <w:lsdException w:name="Quote" w:semiHidden="0" w:uiPriority="29" w:unhideWhenUsed="0" w:qFormat="1"/>
-    <w:lsdException w:name="Intense Quote" w:semiHidden="0" w:uiPriority="30" w:unhideWhenUsed="0" w:qFormat="1"/>
-    <w:lsdException w:name="Medium List 2 Accent 1" w:semiHidden="0" w:uiPriority="66" w:unhideWhenUsed="0"/>
-    <w:lsdException w:name="Medium Grid 1 Accent 1" w:semiHidden="0" w:uiPriority="67" w:unhideWhenUsed="0"/>
-    <w:lsdException w:name="Medium Grid 2 Accent 1" w:semiHidden="0" w:uiPriority="68" w:unhideWhenUsed="0"/>
-    <w:lsdException w:name="Medium Grid 3 Accent 1" w:semiHidden="0" w:uiPriority="69" w:unhideWhenUsed="0"/>
-    <w:lsdException w:name="Dark List Accent 1" w:semiHidden="0" w:uiPriority="70" w:unhideWhenUsed="0"/>
-    <w:lsdException w:name="Colorful Shading Accent 1" w:semiHidden="0" w:uiPriority="71" w:unhideWhenUsed="0"/>
-    <w:lsdException w:name="Colorful List Accent 1" w:semiHidden="0" w:uiPriority="72" w:unhideWhenUsed="0"/>
-    <w:lsdException w:name="Colorful Grid Accent 1" w:semiHidden="0" w:uiPriority="73" w:unhideWhenUsed="0"/>
-    <w:lsdException w:name="Light Shading Accent 2" w:semiHidden="0" w:uiPriority="60" w:unhideWhenUsed="0"/>
-    <w:lsdException w:name="Light List Accent 2" w:semiHidden="0" w:uiPriority="61" w:unhideWhenUsed="0"/>
-    <w:lsdException w:name="Light Grid Accent 2" w:semiHidden="0" w:uiPriority="62" w:unhideWhenUsed="0"/>
-    <w:lsdException w:name="Medium Shading 1 Accent 2" w:semiHidden="0" w:uiPriority="63" w:unhideWhenUsed="0"/>
-    <w:lsdException w:name="Medium Shading 2 Accent 2" w:semiHidden="0" w:uiPriority="64" w:unhideWhenUsed="0"/>
-    <w:lsdException w:name="Medium List 1 Accent 2" w:semiHidden="0" w:uiPriority="65" w:unhideWhenUsed="0"/>
-    <w:lsdException w:name="Medium List 2 Accent 2" w:semiHidden="0" w:uiPriority="66" w:unhideWhenUsed="0"/>
-    <w:lsdException w:name="Medium Grid 1 Accent 2" w:semiHidden="0" w:uiPriority="67" w:unhideWhenUsed="0"/>
-    <w:lsdException w:name="Medium Grid 2 Accent 2" w:semiHidden="0" w:uiPriority="68" w:unhideWhenUsed="0"/>
-    <w:lsdException w:name="Medium Grid 3 Accent 2" w:semiHidden="0" w:uiPriority="69" w:unhideWhenUsed="0"/>
-    <w:lsdException w:name="Dark List Accent 2" w:semiHidden="0" w:uiPriority="70" w:unhideWhenUsed="0"/>
-    <w:lsdException w:name="Colorful Shading Accent 2" w:semiHidden="0" w:uiPriority="71" w:unhideWhenUsed="0"/>
-    <w:lsdException w:name="Colorful List Accent 2" w:semiHidden="0" w:uiPriority="72" w:unhideWhenUsed="0"/>
-    <w:lsdException w:name="Colorful Grid Accent 2" w:semiHidden="0" w:uiPriority="73" w:unhideWhenUsed="0"/>
-    <w:lsdException w:name="Light Shading Accent 3" w:semiHidden="0" w:uiPriority="60" w:unhideWhenUsed="0"/>
-    <w:lsdException w:name="Light List Accent 3" w:semiHidden="0" w:uiPriority="61" w:unhideWhenUsed="0"/>
-    <w:lsdException w:name="Light Grid Accent 3" w:semiHidden="0" w:uiPriority="62" w:unhideWhenUsed="0"/>
-    <w:lsdException w:name="Medium Shading 1 Accent 3" w:semiHidden="0" w:uiPriority="63" w:unhideWhenUsed="0"/>
-    <w:lsdException w:name="Medium Shading 2 Accent 3" w:semiHidden="0" w:uiPriority="64" w:unhideWhenUsed="0"/>
-    <w:lsdException w:name="Medium List 1 Accent 3" w:semiHidden="0" w:uiPriority="65" w:unhideWhenUsed="0"/>
-    <w:lsdException w:name="Medium List 2 Accent 3" w:semiHidden="0" w:uiPriority="66" w:unhideWhenUsed="0"/>
-    <w:lsdException w:name="Medium Grid 1 Accent 3" w:semiHidden="0" w:uiPriority="67" w:unhideWhenUsed="0"/>
-    <w:lsdException w:name="Medium Grid 2 Accent 3" w:semiHidden="0" w:uiPriority="68" w:unhideWhenUsed="0"/>
-    <w:lsdException w:name="Medium Grid 3 Accent 3" w:semiHidden="0" w:uiPriority="69" w:unhideWhenUsed="0"/>
-    <w:lsdException w:name="Dark List Accent 3" w:semiHidden="0" w:uiPriority="70" w:unhideWhenUsed="0"/>
-    <w:lsdException w:name="Colorful Shading Accent 3" w:semiHidden="0" w:uiPriority="71" w:unhideWhenUsed="0"/>
-    <w:lsdException w:name="Colorful List Accent 3" w:semiHidden="0" w:uiPriority="72" w:unhideWhenUsed="0"/>
-    <w:lsdException w:name="Colorful Grid Accent 3" w:semiHidden="0" w:uiPriority="73" w:unhideWhenUsed="0"/>
-    <w:lsdException w:name="Light Shading Accent 4" w:semiHidden="0" w:uiPriority="60" w:unhideWhenUsed="0"/>
-    <w:lsdException w:name="Light List Accent 4" w:semiHidden="0" w:uiPriority="61" w:unhideWhenUsed="0"/>
-    <w:lsdException w:name="Light Grid Accent 4" w:semiHidden="0" w:uiPriority="62" w:unhideWhenUsed="0"/>
-    <w:lsdException w:name="Medium Shading 1 Accent 4" w:semiHidden="0" w:uiPriority="63" w:unhideWhenUsed="0"/>
-    <w:lsdException w:name="Medium Shading 2 Accent 4" w:semiHidden="0" w:uiPriority="64" w:unhideWhenUsed="0"/>
-    <w:lsdException w:name="Medium List 1 Accent 4" w:semiHidden="0" w:uiPriority="65" w:unhideWhenUsed="0"/>
-    <w:lsdException w:name="Medium List 2 Accent 4" w:semiHidden="0" w:uiPriority="66" w:unhideWhenUsed="0"/>
-    <w:lsdException w:name="Medium Grid 1 Accent 4" w:semiHidden="0" w:uiPriority="67" w:unhideWhenUsed="0"/>
-    <w:lsdException w:name="Medium Grid 2 Accent 4" w:semiHidden="0" w:uiPriority="68" w:unhideWhenUsed="0"/>
-    <w:lsdException w:name="Medium Grid 3 Accent 4" w:semiHidden="0" w:uiPriority="69" w:unhideWhenUsed="0"/>
-    <w:lsdException w:name="Dark List Accent 4" w:semiHidden="0" w:uiPriority="70" w:unhideWhenUsed="0"/>
-    <w:lsdException w:name="Colorful Shading Accent 4" w:semiHidden="0" w:uiPriority="71" w:unhideWhenUsed="0"/>
-    <w:lsdException w:name="Colorful List Accent 4" w:semiHidden="0" w:uiPriority="72" w:unhideWhenUsed="0"/>
-    <w:lsdException w:name="Colorful Grid Accent 4" w:semiHidden="0" w:uiPriority="73" w:unhideWhenUsed="0"/>
-    <w:lsdException w:name="Light Shading Accent 5" w:semiHidden="0" w:uiPriority="60" w:unhideWhenUsed="0"/>
-    <w:lsdException w:name="Light List Accent 5" w:semiHidden="0" w:uiPriority="61" w:unhideWhenUsed="0"/>
-    <w:lsdException w:name="Light Grid Accent 5" w:semiHidden="0" w:uiPriority="62" w:unhideWhenUsed="0"/>
-    <w:lsdException w:name="Medium Shading 1 Accent 5" w:semiHidden="0" w:uiPriority="63" w:unhideWhenUsed="0"/>
-    <w:lsdException w:name="Medium Shading 2 Accent 5" w:semiHidden="0" w:uiPriority="64" w:unhideWhenUsed="0"/>
-    <w:lsdException w:name="Medium List 1 Accent 5" w:semiHidden="0" w:uiPriority="65" w:unhideWhenUsed="0"/>
-    <w:lsdException w:name="Medium List 2 Accent 5" w:semiHidden="0" w:uiPriority="66" w:unhideWhenUsed="0"/>
-    <w:lsdException w:name="Medium Grid 1 Accent 5" w:semiHidden="0" w:uiPriority="67" w:unhideWhenUsed="0"/>
-    <w:lsdException w:name="Medium Grid 2 Accent 5" w:semiHidden="0" w:uiPriority="68" w:unhideWhenUsed="0"/>
-    <w:lsdException w:name="Medium Grid 3 Accent 5" w:semiHidden="0" w:uiPriority="69" w:unhideWhenUsed="0"/>
-    <w:lsdException w:name="Dark List Accent 5" w:semiHidden="0" w:uiPriority="70" w:unhideWhenUsed="0"/>
-    <w:lsdException w:name="Colorful Shading Accent 5" w:semiHidden="0" w:uiPriority="71" w:unhideWhenUsed="0"/>
-    <w:lsdException w:name="Colorful List Accent 5" w:semiHidden="0" w:uiPriority="72" w:unhideWhenUsed="0"/>
-    <w:lsdException w:name="Colorful Grid Accent 5" w:semiHidden="0" w:uiPriority="73" w:unhideWhenUsed="0"/>
-    <w:lsdException w:name="Light Shading Accent 6" w:semiHidden="0" w:uiPriority="60" w:unhideWhenUsed="0"/>
-    <w:lsdException w:name="Light List Accent 6" w:semiHidden="0" w:uiPriority="61" w:unhideWhenUsed="0"/>
-    <w:lsdException w:name="Light Grid Accent 6" w:semiHidden="0" w:uiPriority="62" w:unhideWhenUsed="0"/>
-    <w:lsdException w:name="Medium Shading 1 Accent 6" w:semiHidden="0" w:uiPriority="63" w:unhideWhenUsed="0"/>
-    <w:lsdException w:name="Medium Shading 2 Accent 6" w:semiHidden="0" w:uiPriority="64" w:unhideWhenUsed="0"/>
-    <w:lsdException w:name="Medium List 1 Accent 6" w:semiHidden="0" w:uiPriority="65" w:unhideWhenUsed="0"/>
-    <w:lsdException w:name="Medium List 2 Accent 6" w:semiHidden="0" w:uiPriority="66" w:unhideWhenUsed="0"/>
-    <w:lsdException w:name="Medium Grid 1 Accent 6" w:semiHidden="0" w:uiPriority="67" w:unhideWhenUsed="0"/>
-    <w:lsdException w:name="Medium Grid 2 Accent 6" w:semiHidden="0" w:uiPriority="68" w:unhideWhenUsed="0"/>
-    <w:lsdException w:name="Medium Grid 3 Accent 6" w:semiHidden="0" w:uiPriority="69" w:unhideWhenUsed="0"/>
-    <w:lsdException w:name="Dark List Accent 6" w:semiHidden="0" w:uiPriority="70" w:unhideWhenUsed="0"/>
-    <w:lsdException w:name="Colorful Shading Accent 6" w:semiHidden="0" w:uiPriority="71" w:unhideWhenUsed="0"/>
-    <w:lsdException w:name="Colorful List Accent 6" w:semiHidden="0" w:uiPriority="72" w:unhideWhenUsed="0"/>
-    <w:lsdException w:name="Colorful Grid Accent 6" w:semiHidden="0" w:uiPriority="73" w:unhideWhenUsed="0"/>
-    <w:lsdException w:name="Subtle Emphasis" w:semiHidden="0" w:uiPriority="19" w:unhideWhenUsed="0" w:qFormat="1"/>
-    <w:lsdException w:name="Intense Emphasis" w:semiHidden="0" w:uiPriority="21" w:unhideWhenUsed="0" w:qFormat="1"/>
-    <w:lsdException w:name="Subtle Reference" w:semiHidden="0" w:uiPriority="31" w:unhideWhenUsed="0" w:qFormat="1"/>
-    <w:lsdException w:name="Intense Reference" w:semiHidden="0" w:uiPriority="32" w:unhideWhenUsed="0" w:qFormat="1"/>
-    <w:lsdException w:name="Book Title" w:semiHidden="0" w:uiPriority="33" w:unhideWhenUsed="0" w:qFormat="1"/>
-    <w:lsdException w:name="Bibliography" w:uiPriority="37"/>
-    <w:lsdException w:name="TOC Heading" w:uiPriority="39" w:qFormat="1"/>
-  </w:latentStyles>
-  <w:style w:type="paragraph" w:default="1" w:styleId="Normal">
-    <w:name w:val="Normal"/>
-    <w:qFormat/>
-  </w:style>
-  <w:style w:type="character" w:default="1" w:styleId="DefaultParagraphFont">
-    <w:name w:val="Default Paragraph Font"/>
-    <w:uiPriority w:val="1"/>
-    <w:semiHidden/>
-    <w:unhideWhenUsed/>
-  </w:style>
-  <w:style w:type="table" w:default="1" w:styleId="TableNormal">
-    <w:name w:val="Normal Table"/>
-    <w:uiPriority w:val="99"/>
-    <w:semiHidden/>
-    <w:unhideWhenUsed/>
-    <w:tblPr>
-      <w:tblInd w:w="0" w:type="dxa"/>
-      <w:tblCellMar>
-        <w:top w:w="0" w:type="dxa"/>
-        <w:left w:w="108" w:type="dxa"/>
-        <w:bottom w:w="0" w:type="dxa"/>
-        <w:right w:w="108" w:type="dxa"/>
-      </w:tblCellMar>
-    </w:tblPr>
-  </w:style>
-  <w:style w:type="numbering" w:default="1" w:styleId="NoList">
-    <w:name w:val="No List"/>
-    <w:uiPriority w:val="99"/>
-    <w:semiHidden/>
-    <w:unhideWhenUsed/>
-  </w:style>
-  <w:style w:type="table" w:styleId="TableGrid">
-    <w:name w:val="Table Grid"/>
-    <w:basedOn w:val="TableNormal"/>
-    <w:uiPriority w:val="59"/>
-    <w:rsid w:val="00107218"/>
-    <w:pPr>
-      <w:spacing w:after="0" w:line="240" w:lineRule="auto"/>
-    </w:pPr>
-    <w:tblPr>
-      <w:tblInd w:w="0" w:type="dxa"/>
-      <w:tblBorders>
-        <w:top w:val="single" w:sz="4" w:space="0" w:color="000000" w:themeColor="text1"/>
-        <w:left w:val="single" w:sz="4" w:space="0" w:color="000000" w:themeColor="text1"/>
-        <w:bottom w:val="single" w:sz="4" w:space="0" w:color="000000" w:themeColor="text1"/>
-        <w:right w:val="single" w:sz="4" w:space="0" w:color="000000" w:themeColor="text1"/>
-        <w:insideH w:val="single" w:sz="4" w:space="0" w:color="000000" w:themeColor="text1"/>
-        <w:insideV w:val="single" w:sz="4" w:space="0" w:color="000000" w:themeColor="text1"/>
-      </w:tblBorders>
-      <w:tblCellMar>
-        <w:top w:w="0" w:type="dxa"/>
-        <w:left w:w="108" w:type="dxa"/>
-        <w:bottom w:w="0" w:type="dxa"/>
-        <w:right w:w="108" w:type="dxa"/>
-      </w:tblCellMar>
     </w:tblPr>
   </w:style>
   <w:style w:type="paragraph" w:styleId="Header">

</xml_diff>

<commit_message>
fix(confirmationLetters): fix stamp misplacement in the signature block
Root cause: the "Stamp :- ... Pan No.:- ... Stamp :-" line used 5 tab
characters against only 2 defined tab stops (5250/7050 twips). Past the
last defined stop, Word falls back to default tab intervals — which land
differently across Word, LibreOffice, and the in-app docx-preview renderer,
so the second "Stamp :-" drifted depending on the renderer.

Replaced the three signature-area paragraphs (rule line / Authorized+
Receiver Signature / Stamp+Pan No.+Stamp) with a deterministic borderless
2-column table — same left/right position on every renderer. Verified via
a full render (docxtemplater + docx-preview HTML output): correct cell
placement, 0 leftover tokens, correct page-break count for both combined
and single-letter output.

Co-Authored-By: Claude Sonnet 5 <noreply@anthropic.com>
</commit_message>
<xml_diff>
--- a/assets/templates/confirmation-letter.docx
+++ b/assets/templates/confirmation-letter.docx
@@ -598,107 +598,160 @@
         </w:tabs>
       </w:pPr>
     </w:p>
-    <w:p>
-      <w:pPr>
-        <w:tabs>
-          <w:tab w:val="left" w:pos="5730"/>
-        </w:tabs>
-      </w:pPr>
-      <w:r>
-        <w:t xml:space="preserve">…………………………………     </w:t>
-      </w:r>
-      <w:r>
-        <w:t xml:space="preserve">                                                                                      </w:t>
-      </w:r>
-      <w:r>
-        <w:t xml:space="preserve">      </w:t>
-      </w:r>
-      <w:r>
-        <w:t xml:space="preserve"> …………………………….</w:t>
-      </w:r>
-      <w:r>
-        <w:tab/>
-      </w:r>
-      <w:r>
-        <w:t xml:space="preserve">             </w:t>
-      </w:r>
-    </w:p>
-    <w:p>
-      <w:pPr>
-        <w:tabs>
-          <w:tab w:val="left" w:pos="5730"/>
-        </w:tabs>
-      </w:pPr>
-      <w:r>
-        <w:t xml:space="preserve">Authorized Signature   </w:t>
-      </w:r>
-      <w:r>
-        <w:t xml:space="preserve">                                                                                                 Receiver Signature</w:t>
-      </w:r>
-      <w:r>
-        <w:t xml:space="preserve">                                                                                                               </w:t>
-      </w:r>
-      <w:r>
-        <w:t xml:space="preserve">           </w:t>
-      </w:r>
-    </w:p>
-    <w:p>
-      <w:pPr>
-        <w:tabs>
-          <w:tab w:val="left" w:pos="5250"/>
-          <w:tab w:val="left" w:pos="7050"/>
-        </w:tabs>
-      </w:pPr>
-      <w:r>
-        <w:t xml:space="preserve">  Stamp :-</w:t>
-      </w:r>
-      <w:r>
-        <w:tab/>
-      </w:r>
-      <w:r>
-        <w:t xml:space="preserve">      </w:t>
-      </w:r>
-      <w:r>
-        <w:t xml:space="preserve">                        </w:t>
-      </w:r>
-      <w:r>
-        <w:t xml:space="preserve"> </w:t>
-      </w:r>
-      <w:r>
-        <w:t xml:space="preserve">     </w:t>
-      </w:r>
-      <w:r>
-        <w:t xml:space="preserve"> Pan No.</w:t>
-      </w:r>
-      <w:r>
-        <w:t>:-</w:t>
-      </w:r>
-      <w:r>
-        <w:tab/>
-      </w:r>
-      <w:r>
-        <w:tab/>
-      </w:r>
-      <w:r>
-        <w:tab/>
-      </w:r>
-      <w:r>
-        <w:tab/>
-        <w:t xml:space="preserve">     </w:t>
-      </w:r>
-      <w:r>
-        <w:t xml:space="preserve">                            </w:t>
-      </w:r>
-      <w:r>
-        <w:t xml:space="preserve">   </w:t>
-      </w:r>
-      <w:r>
-        <w:t xml:space="preserve"> </w:t>
-      </w:r>
-      <w:r>
-        <w:t>Stamp :-</w:t>
-      </w:r>
-    </w:p>
+    <w:tbl>
+      <w:tblPr>
+        <w:tblW w:w="9636" w:type="dxa"/>
+        <w:tblBorders>
+          <w:top w:val="nil"/>
+          <w:left w:val="nil"/>
+          <w:bottom w:val="nil"/>
+          <w:right w:val="nil"/>
+          <w:insideH w:val="nil"/>
+          <w:insideV w:val="nil"/>
+        </w:tblBorders>
+        <w:tblCellMar>
+          <w:top w:w="60" w:type="dxa"/>
+          <w:bottom w:w="60" w:type="dxa"/>
+        </w:tblCellMar>
+      </w:tblPr>
+      <w:tblGrid>
+        <w:gridCol w:w="4818"/>
+        <w:gridCol w:w="4818"/>
+      </w:tblGrid>
+      <w:tr>
+        <w:tc>
+          <w:tcPr>
+            <w:tcW w:w="4818" w:type="dxa"/>
+            <w:tcBorders>
+              <w:top w:val="nil"/>
+              <w:left w:val="nil"/>
+              <w:bottom w:val="nil"/>
+              <w:right w:val="nil"/>
+            </w:tcBorders>
+          </w:tcPr>
+          <w:p>
+            <w:r>
+              <w:t xml:space="preserve">………………………………….</w:t>
+            </w:r>
+          </w:p>
+        </w:tc>
+        <w:tc>
+          <w:tcPr>
+            <w:tcW w:w="4818" w:type="dxa"/>
+            <w:tcBorders>
+              <w:top w:val="nil"/>
+              <w:left w:val="nil"/>
+              <w:bottom w:val="nil"/>
+              <w:right w:val="nil"/>
+            </w:tcBorders>
+          </w:tcPr>
+          <w:p>
+            <w:r>
+              <w:t xml:space="preserve">………………………………….</w:t>
+            </w:r>
+          </w:p>
+        </w:tc>
+      </w:tr>
+      <w:tr>
+        <w:tc>
+          <w:tcPr>
+            <w:tcW w:w="4818" w:type="dxa"/>
+            <w:tcBorders>
+              <w:top w:val="nil"/>
+              <w:left w:val="nil"/>
+              <w:bottom w:val="nil"/>
+              <w:right w:val="nil"/>
+            </w:tcBorders>
+          </w:tcPr>
+          <w:p>
+            <w:r>
+              <w:t xml:space="preserve">Authorized Signature</w:t>
+            </w:r>
+          </w:p>
+        </w:tc>
+        <w:tc>
+          <w:tcPr>
+            <w:tcW w:w="4818" w:type="dxa"/>
+            <w:tcBorders>
+              <w:top w:val="nil"/>
+              <w:left w:val="nil"/>
+              <w:bottom w:val="nil"/>
+              <w:right w:val="nil"/>
+            </w:tcBorders>
+          </w:tcPr>
+          <w:p>
+            <w:r>
+              <w:t xml:space="preserve">Receiver Signature</w:t>
+            </w:r>
+          </w:p>
+        </w:tc>
+      </w:tr>
+      <w:tr>
+        <w:tc>
+          <w:tcPr>
+            <w:tcW w:w="4818" w:type="dxa"/>
+            <w:tcBorders>
+              <w:top w:val="nil"/>
+              <w:left w:val="nil"/>
+              <w:bottom w:val="nil"/>
+              <w:right w:val="nil"/>
+            </w:tcBorders>
+          </w:tcPr>
+          <w:p>
+            <w:r>
+              <w:t xml:space="preserve">Stamp :-</w:t>
+            </w:r>
+          </w:p>
+        </w:tc>
+        <w:tc>
+          <w:tcPr>
+            <w:tcW w:w="4818" w:type="dxa"/>
+            <w:tcBorders>
+              <w:top w:val="nil"/>
+              <w:left w:val="nil"/>
+              <w:bottom w:val="nil"/>
+              <w:right w:val="nil"/>
+            </w:tcBorders>
+          </w:tcPr>
+          <w:p>
+            <w:r>
+              <w:t xml:space="preserve">Pan No.:-</w:t>
+            </w:r>
+          </w:p>
+        </w:tc>
+      </w:tr>
+      <w:tr>
+        <w:tc>
+          <w:tcPr>
+            <w:tcW w:w="4818" w:type="dxa"/>
+            <w:tcBorders>
+              <w:top w:val="nil"/>
+              <w:left w:val="nil"/>
+              <w:bottom w:val="nil"/>
+              <w:right w:val="nil"/>
+            </w:tcBorders>
+          </w:tcPr>
+          <w:p/>
+        </w:tc>
+        <w:tc>
+          <w:tcPr>
+            <w:tcW w:w="4818" w:type="dxa"/>
+            <w:tcBorders>
+              <w:top w:val="nil"/>
+              <w:left w:val="nil"/>
+              <w:bottom w:val="nil"/>
+              <w:right w:val="nil"/>
+            </w:tcBorders>
+          </w:tcPr>
+          <w:p>
+            <w:r>
+              <w:t xml:space="preserve">Stamp:-</w:t>
+            </w:r>
+          </w:p>
+        </w:tc>
+      </w:tr>
+    </w:tbl>
+    <w:p/>
     <w:p>
       <w:r>
         <w:lastRenderedPageBreak/>

</xml_diff>

<commit_message>
fix(confirmationLetters): tighten the gap before the signature block
Three stacked blank paragraphs sat between "Please do the needful..." and
the signature table, each carrying default paragraph spacing (~10pt
margin + line height) — roughly 2-3x more vertical gap than intended,
pushing the whole signature block down and away from the letter body.
Reduced to one blank paragraph with tight spacing.

Co-Authored-By: Claude Sonnet 5 <noreply@anthropic.com>
</commit_message>
<xml_diff>
--- a/assets/templates/confirmation-letter.docx
+++ b/assets/templates/confirmation-letter.docx
@@ -579,20 +579,7 @@
     </w:p>
     <w:p>
       <w:pPr>
-        <w:tabs>
-          <w:tab w:val="left" w:pos="5730"/>
-        </w:tabs>
-      </w:pPr>
-    </w:p>
-    <w:p>
-      <w:pPr>
-        <w:tabs>
-          <w:tab w:val="left" w:pos="5730"/>
-        </w:tabs>
-      </w:pPr>
-    </w:p>
-    <w:p>
-      <w:pPr>
+        <w:spacing w:after="120"/>
         <w:tabs>
           <w:tab w:val="left" w:pos="5730"/>
         </w:tabs>

</xml_diff>

<commit_message>
fix(confirmationLetters): add a middle gap so the receiver block sits right, not centered
The signature table was two equal-width columns spanning the full content
width with nothing between them, so "Receiver Signature" sat immediately
against "Authorized Signature" at the horizontal middle instead of over
toward the right margin. Added a third, empty spacer column between them
(3600 / 2436 / 3600 twips) so the receiver block reads as its own block on
the right, matching a standard two-signature-block letter layout.

Co-Authored-By: Claude Sonnet 5 <noreply@anthropic.com>
</commit_message>
<xml_diff>
--- a/assets/templates/confirmation-letter.docx
+++ b/assets/templates/confirmation-letter.docx
@@ -602,13 +602,14 @@
         </w:tblCellMar>
       </w:tblPr>
       <w:tblGrid>
-        <w:gridCol w:w="4818"/>
-        <w:gridCol w:w="4818"/>
+        <w:gridCol w:w="3600"/>
+        <w:gridCol w:w="2436"/>
+        <w:gridCol w:w="3600"/>
       </w:tblGrid>
       <w:tr>
         <w:tc>
           <w:tcPr>
-            <w:tcW w:w="4818" w:type="dxa"/>
+            <w:tcW w:w="3600" w:type="dxa"/>
             <w:tcBorders>
               <w:top w:val="nil"/>
               <w:left w:val="nil"/>
@@ -624,7 +625,7 @@
         </w:tc>
         <w:tc>
           <w:tcPr>
-            <w:tcW w:w="4818" w:type="dxa"/>
+            <w:tcW w:w="2436" w:type="dxa"/>
             <w:tcBorders>
               <w:top w:val="nil"/>
               <w:left w:val="nil"/>
@@ -632,17 +633,11 @@
               <w:right w:val="nil"/>
             </w:tcBorders>
           </w:tcPr>
-          <w:p>
-            <w:r>
-              <w:t xml:space="preserve">………………………………….</w:t>
-            </w:r>
-          </w:p>
-        </w:tc>
-      </w:tr>
-      <w:tr>
-        <w:tc>
-          <w:tcPr>
-            <w:tcW w:w="4818" w:type="dxa"/>
+          <w:p/>
+        </w:tc>
+        <w:tc>
+          <w:tcPr>
+            <w:tcW w:w="3600" w:type="dxa"/>
             <w:tcBorders>
               <w:top w:val="nil"/>
               <w:left w:val="nil"/>
@@ -652,13 +647,15 @@
           </w:tcPr>
           <w:p>
             <w:r>
-              <w:t xml:space="preserve">Authorized Signature</w:t>
-            </w:r>
-          </w:p>
-        </w:tc>
-        <w:tc>
-          <w:tcPr>
-            <w:tcW w:w="4818" w:type="dxa"/>
+              <w:t xml:space="preserve">………………………………….</w:t>
+            </w:r>
+          </w:p>
+        </w:tc>
+      </w:tr>
+      <w:tr>
+        <w:tc>
+          <w:tcPr>
+            <w:tcW w:w="3600" w:type="dxa"/>
             <w:tcBorders>
               <w:top w:val="nil"/>
               <w:left w:val="nil"/>
@@ -668,6 +665,34 @@
           </w:tcPr>
           <w:p>
             <w:r>
+              <w:t xml:space="preserve">Authorized Signature</w:t>
+            </w:r>
+          </w:p>
+        </w:tc>
+        <w:tc>
+          <w:tcPr>
+            <w:tcW w:w="2436" w:type="dxa"/>
+            <w:tcBorders>
+              <w:top w:val="nil"/>
+              <w:left w:val="nil"/>
+              <w:bottom w:val="nil"/>
+              <w:right w:val="nil"/>
+            </w:tcBorders>
+          </w:tcPr>
+          <w:p/>
+        </w:tc>
+        <w:tc>
+          <w:tcPr>
+            <w:tcW w:w="3600" w:type="dxa"/>
+            <w:tcBorders>
+              <w:top w:val="nil"/>
+              <w:left w:val="nil"/>
+              <w:bottom w:val="nil"/>
+              <w:right w:val="nil"/>
+            </w:tcBorders>
+          </w:tcPr>
+          <w:p>
+            <w:r>
               <w:t xml:space="preserve">Receiver Signature</w:t>
             </w:r>
           </w:p>
@@ -676,7 +701,7 @@
       <w:tr>
         <w:tc>
           <w:tcPr>
-            <w:tcW w:w="4818" w:type="dxa"/>
+            <w:tcW w:w="3600" w:type="dxa"/>
             <w:tcBorders>
               <w:top w:val="nil"/>
               <w:left w:val="nil"/>
@@ -693,7 +718,19 @@
         </w:tc>
         <w:tc>
           <w:tcPr>
-            <w:tcW w:w="4818" w:type="dxa"/>
+            <w:tcW w:w="2436" w:type="dxa"/>
+            <w:tcBorders>
+              <w:top w:val="nil"/>
+              <w:left w:val="nil"/>
+              <w:bottom w:val="nil"/>
+              <w:right w:val="nil"/>
+            </w:tcBorders>
+          </w:tcPr>
+          <w:p/>
+        </w:tc>
+        <w:tc>
+          <w:tcPr>
+            <w:tcW w:w="3600" w:type="dxa"/>
             <w:tcBorders>
               <w:top w:val="nil"/>
               <w:left w:val="nil"/>

</xml_diff>

<commit_message>
fix(confirmationLetters): right-align the receiver block instead of leading-space padding
You edited the template in Word and pushed the right column's text over
with 27-40 literal leading spaces per line — the same fragile trick that
caused the earlier stamp-misplacement bug, since space width isn't fixed
and renders differently across Word/LibreOffice/the in-app docx-preview.

Replaced the leading-space runs with proper paragraph right-alignment
(w:jc="right") on the four right-column paragraphs (dots, "Receiver
Signature", "Pan No.:-", "Stamp :-"). Same visual effect — the receiver
block sits at the right margin, separated from the left block by the
spacer column — but deterministic across every renderer. Verified via the
app's real docx-preview render: right column reads textAlign:"right" in
the DOM, left column and the spacer are untouched.

Co-Authored-By: Claude Sonnet 5 <noreply@anthropic.com>
</commit_message>
<xml_diff>
--- a/assets/templates/confirmation-letter.docx
+++ b/assets/templates/confirmation-letter.docx
@@ -21,18 +21,35 @@
         </w:rPr>
       </w:pPr>
       <w:r>
-        <w:t xml:space="preserve"> M/S :-  {{partyName}}</w:t>
-      </w:r>
-    </w:p>
-    <w:p>
-      <w:r>
-        <w:t>Vat No :-  {{partyPan}}</w:t>
+        <w:t xml:space="preserve"> M/</w:t>
+      </w:r>
+      <w:proofErr w:type="gramStart"/>
+      <w:r>
+        <w:t>S :</w:t>
+      </w:r>
+      <w:proofErr w:type="gramEnd"/>
+      <w:r>
+        <w:t>-  {{partyName}}</w:t>
+      </w:r>
+    </w:p>
+    <w:p>
+      <w:r>
+        <w:t xml:space="preserve">Vat </w:t>
+      </w:r>
+      <w:proofErr w:type="gramStart"/>
+      <w:r>
+        <w:t>No :</w:t>
+      </w:r>
+      <w:proofErr w:type="gramEnd"/>
+      <w:r>
+        <w:t>-  {{partyPan}}</w:t>
       </w:r>
     </w:p>
     <w:p>
       <w:r>
         <w:t xml:space="preserve">                          </w:t>
       </w:r>
+      <w:proofErr w:type="gramStart"/>
       <w:r>
         <w:t>Subject</w:t>
       </w:r>
@@ -40,7 +57,11 @@
         <w:t xml:space="preserve"> </w:t>
       </w:r>
       <w:r>
-        <w:t xml:space="preserve">:- Confirmation of Account Balance </w:t>
+        <w:t>:</w:t>
+      </w:r>
+      <w:proofErr w:type="gramEnd"/>
+      <w:r>
+        <w:t xml:space="preserve">- Confirmation of Account Balance </w:t>
       </w:r>
       <w:r>
         <w:t>&amp;</w:t>
@@ -76,13 +97,21 @@
         <w:t xml:space="preserve">            We P</w:t>
       </w:r>
       <w:r>
-        <w:t>rove that as per our account records the purchase/sales</w:t>
+        <w:t>rove that as per our account records the purchase/</w:t>
+      </w:r>
+      <w:proofErr w:type="gramStart"/>
+      <w:r>
+        <w:t>sales</w:t>
       </w:r>
       <w:r>
         <w:t xml:space="preserve"> </w:t>
       </w:r>
       <w:r>
-        <w:t xml:space="preserve"> transactions and closing </w:t>
+        <w:t xml:space="preserve"> transactions</w:t>
+      </w:r>
+      <w:proofErr w:type="gramEnd"/>
+      <w:r>
+        <w:t xml:space="preserve"> and closing </w:t>
       </w:r>
       <w:r>
         <w:t>balance with you for the f/Y {{fyLabel}}</w:t>
@@ -551,7 +580,15 @@
         <w:t>For any query regarding books of a</w:t>
       </w:r>
       <w:r>
-        <w:t xml:space="preserve">ccount, please contact , Phone </w:t>
+        <w:t xml:space="preserve">ccount, please </w:t>
+      </w:r>
+      <w:proofErr w:type="gramStart"/>
+      <w:r>
+        <w:t>contact ,</w:t>
+      </w:r>
+      <w:proofErr w:type="gramEnd"/>
+      <w:r>
+        <w:t xml:space="preserve"> Phone </w:t>
       </w:r>
       <w:r>
         <w:t xml:space="preserve"> no:-</w:t>
@@ -579,10 +616,10 @@
     </w:p>
     <w:p>
       <w:pPr>
-        <w:spacing w:after="120"/>
         <w:tabs>
           <w:tab w:val="left" w:pos="5730"/>
         </w:tabs>
+        <w:spacing w:after="120"/>
       </w:pPr>
     </w:p>
     <w:tbl>
@@ -600,6 +637,7 @@
           <w:top w:w="60" w:type="dxa"/>
           <w:bottom w:w="60" w:type="dxa"/>
         </w:tblCellMar>
+        <w:tblLook w:val="04A0" w:firstRow="1" w:lastRow="0" w:firstColumn="1" w:lastColumn="0" w:noHBand="0" w:noVBand="1"/>
       </w:tblPr>
       <w:tblGrid>
         <w:gridCol w:w="3600"/>
@@ -619,7 +657,7 @@
           </w:tcPr>
           <w:p>
             <w:r>
-              <w:t xml:space="preserve">………………………………….</w:t>
+              <w:t>………………………………….</w:t>
             </w:r>
           </w:p>
         </w:tc>
@@ -646,8 +684,11 @@
             </w:tcBorders>
           </w:tcPr>
           <w:p>
-            <w:r>
-              <w:t xml:space="preserve">………………………………….</w:t>
+            <w:pPr>
+              <w:jc w:val="right"/>
+            </w:pPr>
+            <w:r>
+              <w:t>………………………………….</w:t>
             </w:r>
           </w:p>
         </w:tc>
@@ -665,7 +706,7 @@
           </w:tcPr>
           <w:p>
             <w:r>
-              <w:t xml:space="preserve">Authorized Signature</w:t>
+              <w:t>Authorized Signature</w:t>
             </w:r>
           </w:p>
         </w:tc>
@@ -692,8 +733,11 @@
             </w:tcBorders>
           </w:tcPr>
           <w:p>
-            <w:r>
-              <w:t xml:space="preserve">Receiver Signature</w:t>
+            <w:pPr>
+              <w:jc w:val="right"/>
+            </w:pPr>
+            <w:r>
+              <w:t>Receiver Signature</w:t>
             </w:r>
           </w:p>
         </w:tc>
@@ -708,11 +752,15 @@
               <w:bottom w:val="nil"/>
               <w:right w:val="nil"/>
             </w:tcBorders>
-            <w:vAlign w:val="top"/>
-          </w:tcPr>
-          <w:p>
-            <w:r>
-              <w:t xml:space="preserve">Stamp :-</w:t>
+          </w:tcPr>
+          <w:p>
+            <w:proofErr w:type="gramStart"/>
+            <w:r>
+              <w:t>Stamp :</w:t>
+            </w:r>
+            <w:proofErr w:type="gramEnd"/>
+            <w:r>
+              <w:t>-</w:t>
             </w:r>
           </w:p>
         </w:tc>
@@ -739,13 +787,29 @@
             </w:tcBorders>
           </w:tcPr>
           <w:p>
-            <w:r>
-              <w:t xml:space="preserve">Pan No.:-</w:t>
-            </w:r>
-          </w:p>
-          <w:p>
-            <w:r>
-              <w:t xml:space="preserve">Stamp :-</w:t>
+            <w:pPr>
+              <w:jc w:val="right"/>
+            </w:pPr>
+            <w:r>
+              <w:t xml:space="preserve">Pan </w:t>
+            </w:r>
+            <w:proofErr w:type="gramStart"/>
+            <w:r>
+              <w:t>No.:-</w:t>
+            </w:r>
+            <w:proofErr w:type="gramEnd"/>
+          </w:p>
+          <w:p>
+            <w:pPr>
+              <w:jc w:val="right"/>
+            </w:pPr>
+            <w:proofErr w:type="gramStart"/>
+            <w:r>
+              <w:t>Stamp :</w:t>
+            </w:r>
+            <w:proofErr w:type="gramEnd"/>
+            <w:r>
+              <w:t>-</w:t>
             </w:r>
           </w:p>
         </w:tc>
@@ -870,7 +934,21 @@
       <w:rPr>
         <w:b/>
       </w:rPr>
-      <w:t>Pan No:-  {{firmPan}}</w:t>
+      <w:t xml:space="preserve">Pan </w:t>
+    </w:r>
+    <w:proofErr w:type="gramStart"/>
+    <w:r>
+      <w:rPr>
+        <w:b/>
+      </w:rPr>
+      <w:t>No:-</w:t>
+    </w:r>
+    <w:proofErr w:type="gramEnd"/>
+    <w:r>
+      <w:rPr>
+        <w:b/>
+      </w:rPr>
+      <w:t xml:space="preserve">  {{firmPan}}</w:t>
     </w:r>
     <w:r>
       <w:rPr>
@@ -894,7 +972,20 @@
         <w:b/>
       </w:rPr>
       <w:tab/>
-      <w:t>Date:-  {{letterDate}}</w:t>
+    </w:r>
+    <w:proofErr w:type="gramStart"/>
+    <w:r>
+      <w:rPr>
+        <w:b/>
+      </w:rPr>
+      <w:t>Date:-</w:t>
+    </w:r>
+    <w:proofErr w:type="gramEnd"/>
+    <w:r>
+      <w:rPr>
+        <w:b/>
+      </w:rPr>
+      <w:t xml:space="preserve">  {{letterDate}}</w:t>
     </w:r>
   </w:p>
 </w:hdr>

</xml_diff>

<commit_message>
fix(confirmationLetters): fix broken PAN token in the receiver block
While repositioning "Pan No.:-" in Word, the {{partyPan}} token got
retyped as {{partypan}} (lowercase p) - didn't match the partyPan field
in the render data, so it rendered as the literal string "undefined".
Fixed the casing only; your positioning is untouched. Verified via render:
"Pan No.:- 305658609" instead of "Pan No.:- undefined".

Co-Authored-By: Claude Sonnet 5 <noreply@anthropic.com>
</commit_message>
<xml_diff>
--- a/assets/templates/confirmation-letter.docx
+++ b/assets/templates/confirmation-letter.docx
@@ -965,7 +965,18 @@
               <w:jc w:val="center"/>
             </w:pPr>
             <w:r>
-              <w:t>Pan No.:-  {{</w:t>
+              <w:t xml:space="preserve">    </w:t>
+            </w:r>
+            <w:r>
+              <w:t xml:space="preserve">Pan </w:t>
+            </w:r>
+            <w:proofErr w:type="gramStart"/>
+            <w:r>
+              <w:t>No.:-</w:t>
+            </w:r>
+            <w:proofErr w:type="gramEnd"/>
+            <w:r>
+              <w:t xml:space="preserve">  {{</w:t>
             </w:r>
             <w:proofErr w:type="spellStart"/>
             <w:r>
@@ -1658,7 +1669,6 @@
   <w:style w:type="character" w:default="1" w:styleId="DefaultParagraphFont">
     <w:name w:val="Default Paragraph Font"/>
     <w:uiPriority w:val="1"/>
-    <w:semiHidden/>
     <w:unhideWhenUsed/>
   </w:style>
   <w:style w:type="table" w:default="1" w:styleId="TableNormal">

</xml_diff>

<commit_message>
fix(confirmationLetters): reflect user's latest Pan No. positioning edit
Verified the file as-is before committing: no header-split regression
(single header reference), PAN token intact and correctly cased, both
tables still within the printable content width, renders cleanly with
0 leftover tokens across a 2-letter combined document. No changes of my
own — positioning is exactly as the user set it in Word.

Co-Authored-By: Claude Sonnet 5 <noreply@anthropic.com>
</commit_message>
<xml_diff>
--- a/assets/templates/confirmation-letter.docx
+++ b/assets/templates/confirmation-letter.docx
@@ -961,11 +961,11 @@
             </w:tcBorders>
           </w:tcPr>
           <w:p>
-            <w:pPr>
-              <w:jc w:val="center"/>
-            </w:pPr>
-            <w:r>
-              <w:t xml:space="preserve">    </w:t>
+            <w:r>
+              <w:t xml:space="preserve">         </w:t>
+            </w:r>
+            <w:r>
+              <w:t xml:space="preserve"> </w:t>
             </w:r>
             <w:r>
               <w:t xml:space="preserve">Pan </w:t>
@@ -1669,6 +1669,7 @@
   <w:style w:type="character" w:default="1" w:styleId="DefaultParagraphFont">
     <w:name w:val="Default Paragraph Font"/>
     <w:uiPriority w:val="1"/>
+    <w:semiHidden/>
     <w:unhideWhenUsed/>
   </w:style>
   <w:style w:type="table" w:default="1" w:styleId="TableNormal">

</xml_diff>

<commit_message>
fix(confirmationLetters): align Receiver Signature, Pan No., and Stamp to the same start position
All three lines used leading-space padding for positioning (10 space
characters each) - an identical count, but space-character width is
font-metric-dependent, so identical counts don't guarantee identical
rendered position across renderers. That's why "Pan No.:-" visually sat
further right than "Receiver Signature"/"Stamp :-" despite having the
"same" indent by character count.

Replaced all three with one deterministic paragraph left-indent (200
twips), applied identically. Verified via the app's real docx-preview
render: all three report the exact same marginLeft (13.3333px) in the
DOM, not just a visual approximation.

Co-Authored-By: Claude Sonnet 5 <noreply@anthropic.com>
</commit_message>
<xml_diff>
--- a/assets/templates/confirmation-letter.docx
+++ b/assets/templates/confirmation-letter.docx
@@ -907,9 +907,9 @@
             </w:tcBorders>
           </w:tcPr>
           <w:p>
-            <w:r>
-              <w:t xml:space="preserve">          </w:t>
-            </w:r>
+            <w:pPr>
+              <w:ind w:left="200"/>
+            </w:pPr>
             <w:r>
               <w:t>Receiver Signature</w:t>
             </w:r>
@@ -961,22 +961,11 @@
             </w:tcBorders>
           </w:tcPr>
           <w:p>
-            <w:r>
-              <w:t xml:space="preserve">         </w:t>
-            </w:r>
-            <w:r>
-              <w:t xml:space="preserve"> </w:t>
-            </w:r>
-            <w:r>
-              <w:t xml:space="preserve">Pan </w:t>
-            </w:r>
-            <w:proofErr w:type="gramStart"/>
-            <w:r>
-              <w:t>No.:-</w:t>
-            </w:r>
-            <w:proofErr w:type="gramEnd"/>
-            <w:r>
-              <w:t xml:space="preserve">  {{</w:t>
+            <w:pPr>
+              <w:ind w:left="200"/>
+            </w:pPr>
+            <w:r>
+              <w:t xml:space="preserve">Pan No.:-  {{</w:t>
             </w:r>
             <w:proofErr w:type="spellStart"/>
             <w:r>
@@ -988,9 +977,9 @@
             </w:r>
           </w:p>
           <w:p>
-            <w:r>
-              <w:t xml:space="preserve">          </w:t>
-            </w:r>
+            <w:pPr>
+              <w:ind w:left="200"/>
+            </w:pPr>
             <w:proofErr w:type="gramStart"/>
             <w:r>
               <w:t>Stamp :</w:t>

</xml_diff>

<commit_message>
fix(confirmationLetters): align the dots line with Receiver Signature/Pan No./Stamp
Missed this one in the last pass - the blank signing line above "Receiver
Signature" still used its own leading-space padding (9 spaces, no real
indent), so it didn't share the new deterministic left-indent applied to
the three lines below it. Gave it the same 200-twip w:ind. Verified via
the app's real docx-preview render: all four lines now report the exact
same computed marginLeft (13.3333px).

Co-Authored-By: Claude Sonnet 5 <noreply@anthropic.com>
</commit_message>
<xml_diff>
--- a/assets/templates/confirmation-letter.docx
+++ b/assets/templates/confirmation-letter.docx
@@ -858,9 +858,9 @@
             </w:tcBorders>
           </w:tcPr>
           <w:p>
-            <w:r>
-              <w:t xml:space="preserve">         </w:t>
-            </w:r>
+            <w:pPr>
+              <w:ind w:left="200"/>
+            </w:pPr>
             <w:r>
               <w:t>………………………………….</w:t>
             </w:r>

</xml_diff>